<commit_message>
Update CV and reference documents
Replace binary CV files with revised versions: cv.pdf and cv-reference.docx. These updates refresh the content/formatting of the resume and reference document (binary changes only).
</commit_message>
<xml_diff>
--- a/cv-reference.docx
+++ b/cv-reference.docx
@@ -1,6 +1,6 @@
 
 <file path=word/document.xml><?xml version="1.0" encoding="utf-8"?>
-<w:document xmlns:wpc="http://schemas.microsoft.com/office/word/2010/wordprocessingCanvas" xmlns:cx="http://schemas.microsoft.com/office/drawing/2014/chartex" xmlns:cx1="http://schemas.microsoft.com/office/drawing/2015/9/8/chartex" xmlns:cx2="http://schemas.microsoft.com/office/drawing/2015/10/21/chartex" xmlns:cx3="http://schemas.microsoft.com/office/drawing/2016/5/9/chartex" xmlns:cx4="http://schemas.microsoft.com/office/drawing/2016/5/10/chartex" xmlns:cx5="http://schemas.microsoft.com/office/drawing/2016/5/11/chartex" xmlns:cx6="http://schemas.microsoft.com/office/drawing/2016/5/12/chartex" xmlns:cx7="http://schemas.microsoft.com/office/drawing/2016/5/13/chartex" xmlns:cx8="http://schemas.microsoft.com/office/drawing/2016/5/14/chartex" xmlns:mc="http://schemas.openxmlformats.org/markup-compatibility/2006" xmlns:aink="http://schemas.microsoft.com/office/drawing/2016/ink" xmlns:am3d="http://schemas.microsoft.com/office/drawing/2017/model3d" xmlns:o="urn:schemas-microsoft-com:office:office" xmlns:oel="http://schemas.microsoft.com/office/2019/extlst" xmlns:r="http://schemas.openxmlformats.org/officeDocument/2006/relationships" xmlns:m="http://schemas.openxmlformats.org/officeDocument/2006/math" xmlns:v="urn:schemas-microsoft-com:vml" xmlns:wp14="http://schemas.microsoft.com/office/word/2010/wordprocessingDrawing" xmlns:wp="http://schemas.openxmlformats.org/drawingml/2006/wordprocessingDrawing" xmlns:w10="urn:schemas-microsoft-com:office:word" xmlns:w="http://schemas.openxmlformats.org/wordprocessingml/2006/main" xmlns:w14="http://schemas.microsoft.com/office/word/2010/wordml" xmlns:w15="http://schemas.microsoft.com/office/word/2012/wordml" xmlns:w16cex="http://schemas.microsoft.com/office/word/2018/wordml/cex" xmlns:w16cid="http://schemas.microsoft.com/office/word/2016/wordml/cid" xmlns:w16="http://schemas.microsoft.com/office/word/2018/wordml" xmlns:w16du="http://schemas.microsoft.com/office/word/2023/wordml/word16du" xmlns:w16sdtdh="http://schemas.microsoft.com/office/word/2020/wordml/sdtdatahash" xmlns:w16sdtfl="http://schemas.microsoft.com/office/word/2024/wordml/sdtformatlock" xmlns:w16se="http://schemas.microsoft.com/office/word/2015/wordml/symex" xmlns:wpg="http://schemas.microsoft.com/office/word/2010/wordprocessingGroup" xmlns:wpi="http://schemas.microsoft.com/office/word/2010/wordprocessingInk" xmlns:wne="http://schemas.microsoft.com/office/word/2006/wordml" xmlns:wps="http://schemas.microsoft.com/office/word/2010/wordprocessingShape" mc:Ignorable="w14 w15 w16se w16cid w16 w16cex w16sdtdh w16sdtfl w16du wp14">
+<w:document xmlns:wpc="http://schemas.microsoft.com/office/word/2010/wordprocessingCanvas" xmlns:cx="http://schemas.microsoft.com/office/drawing/2014/chartex" xmlns:cx1="http://schemas.microsoft.com/office/drawing/2015/9/8/chartex" xmlns:cx2="http://schemas.microsoft.com/office/drawing/2015/10/21/chartex" xmlns:cx3="http://schemas.microsoft.com/office/drawing/2016/5/9/chartex" xmlns:cx4="http://schemas.microsoft.com/office/drawing/2016/5/10/chartex" xmlns:cx5="http://schemas.microsoft.com/office/drawing/2016/5/11/chartex" xmlns:cx6="http://schemas.microsoft.com/office/drawing/2016/5/12/chartex" xmlns:cx7="http://schemas.microsoft.com/office/drawing/2016/5/13/chartex" xmlns:cx8="http://schemas.microsoft.com/office/drawing/2016/5/14/chartex" xmlns:mc="http://schemas.openxmlformats.org/markup-compatibility/2006" xmlns:m="http://schemas.openxmlformats.org/officeDocument/2006/math" xmlns:aink="http://schemas.microsoft.com/office/drawing/2016/ink" xmlns:am3d="http://schemas.microsoft.com/office/drawing/2017/model3d" xmlns:oel="http://schemas.microsoft.com/office/2019/extlst" xmlns:r="http://schemas.openxmlformats.org/officeDocument/2006/relationships" xmlns:wp14="http://schemas.microsoft.com/office/word/2010/wordprocessingDrawing" xmlns:wp="http://schemas.openxmlformats.org/drawingml/2006/wordprocessingDrawing" xmlns:wpg="http://schemas.microsoft.com/office/word/2010/wordprocessingGroup" xmlns:wpi="http://schemas.microsoft.com/office/word/2010/wordprocessingInk" xmlns:wps="http://schemas.microsoft.com/office/word/2010/wordprocessingShape" xmlns:o="urn:schemas-microsoft-com:office:office" xmlns:v="urn:schemas-microsoft-com:vml" xmlns:w10="urn:schemas-microsoft-com:office:word" xmlns:w="http://schemas.openxmlformats.org/wordprocessingml/2006/main" xmlns:w14="http://schemas.microsoft.com/office/word/2010/wordml" xmlns:w15="http://schemas.microsoft.com/office/word/2012/wordml" xmlns:w16cex="http://schemas.microsoft.com/office/word/2018/wordml/cex" xmlns:w16cid="http://schemas.microsoft.com/office/word/2016/wordml/cid" xmlns:w16="http://schemas.microsoft.com/office/word/2018/wordml" xmlns:w16sdtdh="http://schemas.microsoft.com/office/word/2020/wordml/sdtdatahash" xmlns:w16sdtfl="http://schemas.microsoft.com/office/word/2024/wordml/sdtformatlock" xmlns:w16se="http://schemas.microsoft.com/office/word/2015/wordml/symex" xmlns:w16du="http://schemas.microsoft.com/office/word/2023/wordml/word16du" xmlns:wne="http://schemas.microsoft.com/office/word/2006/wordml" mc:Ignorable="w14 w15 w16se w16cid w16 w16cex w16sdtdh w16sdtfl w16du wp14">
   <w:body>
     <w:p>
       <w:pPr>
@@ -161,7 +161,19 @@
           <w:rPr>
             <w:rStyle w:val="Hyperlink"/>
           </w:rPr>
-          <w:t xml:space="preserve"> Hyperlink </w:t>
+          <w:t xml:space="preserve"> </w:t>
+        </w:r>
+        <w:r>
+          <w:rPr>
+            <w:rStyle w:val="Hyperlink"/>
+          </w:rPr>
+          <w:t>Hyperlink</w:t>
+        </w:r>
+        <w:r>
+          <w:rPr>
+            <w:rStyle w:val="Hyperlink"/>
+          </w:rPr>
+          <w:t xml:space="preserve"> </w:t>
         </w:r>
       </w:hyperlink>
       <w:r>
@@ -187,6 +199,7 @@
         <w:pStyle w:val="TableCaption"/>
       </w:pPr>
       <w:r>
+        <w:lastRenderedPageBreak/>
         <w:t xml:space="preserve"> Table caption. </w:t>
       </w:r>
     </w:p>
@@ -316,7 +329,7 @@
 </file>
 
 <file path=word/endnotes.xml><?xml version="1.0" encoding="utf-8"?>
-<w:endnotes xmlns:wpc="http://schemas.microsoft.com/office/word/2010/wordprocessingCanvas" xmlns:cx="http://schemas.microsoft.com/office/drawing/2014/chartex" xmlns:cx1="http://schemas.microsoft.com/office/drawing/2015/9/8/chartex" xmlns:cx2="http://schemas.microsoft.com/office/drawing/2015/10/21/chartex" xmlns:cx3="http://schemas.microsoft.com/office/drawing/2016/5/9/chartex" xmlns:cx4="http://schemas.microsoft.com/office/drawing/2016/5/10/chartex" xmlns:cx5="http://schemas.microsoft.com/office/drawing/2016/5/11/chartex" xmlns:cx6="http://schemas.microsoft.com/office/drawing/2016/5/12/chartex" xmlns:cx7="http://schemas.microsoft.com/office/drawing/2016/5/13/chartex" xmlns:cx8="http://schemas.microsoft.com/office/drawing/2016/5/14/chartex" xmlns:mc="http://schemas.openxmlformats.org/markup-compatibility/2006" xmlns:aink="http://schemas.microsoft.com/office/drawing/2016/ink" xmlns:am3d="http://schemas.microsoft.com/office/drawing/2017/model3d" xmlns:o="urn:schemas-microsoft-com:office:office" xmlns:oel="http://schemas.microsoft.com/office/2019/extlst" xmlns:r="http://schemas.openxmlformats.org/officeDocument/2006/relationships" xmlns:m="http://schemas.openxmlformats.org/officeDocument/2006/math" xmlns:v="urn:schemas-microsoft-com:vml" xmlns:wp14="http://schemas.microsoft.com/office/word/2010/wordprocessingDrawing" xmlns:wp="http://schemas.openxmlformats.org/drawingml/2006/wordprocessingDrawing" xmlns:w10="urn:schemas-microsoft-com:office:word" xmlns:w="http://schemas.openxmlformats.org/wordprocessingml/2006/main" xmlns:w14="http://schemas.microsoft.com/office/word/2010/wordml" xmlns:w15="http://schemas.microsoft.com/office/word/2012/wordml" xmlns:w16cex="http://schemas.microsoft.com/office/word/2018/wordml/cex" xmlns:w16cid="http://schemas.microsoft.com/office/word/2016/wordml/cid" xmlns:w16="http://schemas.microsoft.com/office/word/2018/wordml" xmlns:w16du="http://schemas.microsoft.com/office/word/2023/wordml/word16du" xmlns:w16sdtdh="http://schemas.microsoft.com/office/word/2020/wordml/sdtdatahash" xmlns:w16sdtfl="http://schemas.microsoft.com/office/word/2024/wordml/sdtformatlock" xmlns:w16se="http://schemas.microsoft.com/office/word/2015/wordml/symex" xmlns:wpg="http://schemas.microsoft.com/office/word/2010/wordprocessingGroup" xmlns:wpi="http://schemas.microsoft.com/office/word/2010/wordprocessingInk" xmlns:wne="http://schemas.microsoft.com/office/word/2006/wordml" xmlns:wps="http://schemas.microsoft.com/office/word/2010/wordprocessingShape" mc:Ignorable="w14 w15 w16se w16cid w16 w16cex w16sdtdh w16sdtfl w16du wp14">
+<w:endnotes xmlns:wpc="http://schemas.microsoft.com/office/word/2010/wordprocessingCanvas" xmlns:cx="http://schemas.microsoft.com/office/drawing/2014/chartex" xmlns:cx1="http://schemas.microsoft.com/office/drawing/2015/9/8/chartex" xmlns:cx2="http://schemas.microsoft.com/office/drawing/2015/10/21/chartex" xmlns:cx3="http://schemas.microsoft.com/office/drawing/2016/5/9/chartex" xmlns:cx4="http://schemas.microsoft.com/office/drawing/2016/5/10/chartex" xmlns:cx5="http://schemas.microsoft.com/office/drawing/2016/5/11/chartex" xmlns:cx6="http://schemas.microsoft.com/office/drawing/2016/5/12/chartex" xmlns:cx7="http://schemas.microsoft.com/office/drawing/2016/5/13/chartex" xmlns:cx8="http://schemas.microsoft.com/office/drawing/2016/5/14/chartex" xmlns:mc="http://schemas.openxmlformats.org/markup-compatibility/2006" xmlns:m="http://schemas.openxmlformats.org/officeDocument/2006/math" xmlns:aink="http://schemas.microsoft.com/office/drawing/2016/ink" xmlns:am3d="http://schemas.microsoft.com/office/drawing/2017/model3d" xmlns:oel="http://schemas.microsoft.com/office/2019/extlst" xmlns:r="http://schemas.openxmlformats.org/officeDocument/2006/relationships" xmlns:wp14="http://schemas.microsoft.com/office/word/2010/wordprocessingDrawing" xmlns:wp="http://schemas.openxmlformats.org/drawingml/2006/wordprocessingDrawing" xmlns:wpg="http://schemas.microsoft.com/office/word/2010/wordprocessingGroup" xmlns:wpi="http://schemas.microsoft.com/office/word/2010/wordprocessingInk" xmlns:wps="http://schemas.microsoft.com/office/word/2010/wordprocessingShape" xmlns:o="urn:schemas-microsoft-com:office:office" xmlns:v="urn:schemas-microsoft-com:vml" xmlns:w10="urn:schemas-microsoft-com:office:word" xmlns:w="http://schemas.openxmlformats.org/wordprocessingml/2006/main" xmlns:w14="http://schemas.microsoft.com/office/word/2010/wordml" xmlns:w15="http://schemas.microsoft.com/office/word/2012/wordml" xmlns:w16cex="http://schemas.microsoft.com/office/word/2018/wordml/cex" xmlns:w16cid="http://schemas.microsoft.com/office/word/2016/wordml/cid" xmlns:w16="http://schemas.microsoft.com/office/word/2018/wordml" xmlns:w16sdtdh="http://schemas.microsoft.com/office/word/2020/wordml/sdtdatahash" xmlns:w16sdtfl="http://schemas.microsoft.com/office/word/2024/wordml/sdtformatlock" xmlns:w16se="http://schemas.microsoft.com/office/word/2015/wordml/symex" xmlns:w16du="http://schemas.microsoft.com/office/word/2023/wordml/word16du" xmlns:wne="http://schemas.microsoft.com/office/word/2006/wordml" mc:Ignorable="w14 w15 w16se w16cid w16 w16cex w16sdtdh w16sdtfl w16du wp14">
   <w:endnote w:type="separator" w:id="-1">
     <w:p>
       <w:pPr>
@@ -341,7 +354,7 @@
 </file>
 
 <file path=word/footer1.xml><?xml version="1.0" encoding="utf-8"?>
-<w:ftr xmlns:wpc="http://schemas.microsoft.com/office/word/2010/wordprocessingCanvas" xmlns:cx="http://schemas.microsoft.com/office/drawing/2014/chartex" xmlns:cx1="http://schemas.microsoft.com/office/drawing/2015/9/8/chartex" xmlns:cx2="http://schemas.microsoft.com/office/drawing/2015/10/21/chartex" xmlns:cx3="http://schemas.microsoft.com/office/drawing/2016/5/9/chartex" xmlns:cx4="http://schemas.microsoft.com/office/drawing/2016/5/10/chartex" xmlns:cx5="http://schemas.microsoft.com/office/drawing/2016/5/11/chartex" xmlns:cx6="http://schemas.microsoft.com/office/drawing/2016/5/12/chartex" xmlns:cx7="http://schemas.microsoft.com/office/drawing/2016/5/13/chartex" xmlns:cx8="http://schemas.microsoft.com/office/drawing/2016/5/14/chartex" xmlns:mc="http://schemas.openxmlformats.org/markup-compatibility/2006" xmlns:aink="http://schemas.microsoft.com/office/drawing/2016/ink" xmlns:am3d="http://schemas.microsoft.com/office/drawing/2017/model3d" xmlns:o="urn:schemas-microsoft-com:office:office" xmlns:oel="http://schemas.microsoft.com/office/2019/extlst" xmlns:r="http://schemas.openxmlformats.org/officeDocument/2006/relationships" xmlns:m="http://schemas.openxmlformats.org/officeDocument/2006/math" xmlns:v="urn:schemas-microsoft-com:vml" xmlns:wp14="http://schemas.microsoft.com/office/word/2010/wordprocessingDrawing" xmlns:wp="http://schemas.openxmlformats.org/drawingml/2006/wordprocessingDrawing" xmlns:w10="urn:schemas-microsoft-com:office:word" xmlns:w="http://schemas.openxmlformats.org/wordprocessingml/2006/main" xmlns:w14="http://schemas.microsoft.com/office/word/2010/wordml" xmlns:w15="http://schemas.microsoft.com/office/word/2012/wordml" xmlns:w16cex="http://schemas.microsoft.com/office/word/2018/wordml/cex" xmlns:w16cid="http://schemas.microsoft.com/office/word/2016/wordml/cid" xmlns:w16="http://schemas.microsoft.com/office/word/2018/wordml" xmlns:w16du="http://schemas.microsoft.com/office/word/2023/wordml/word16du" xmlns:w16sdtdh="http://schemas.microsoft.com/office/word/2020/wordml/sdtdatahash" xmlns:w16sdtfl="http://schemas.microsoft.com/office/word/2024/wordml/sdtformatlock" xmlns:w16se="http://schemas.microsoft.com/office/word/2015/wordml/symex" xmlns:wpg="http://schemas.microsoft.com/office/word/2010/wordprocessingGroup" xmlns:wpi="http://schemas.microsoft.com/office/word/2010/wordprocessingInk" xmlns:wne="http://schemas.microsoft.com/office/word/2006/wordml" xmlns:wps="http://schemas.microsoft.com/office/word/2010/wordprocessingShape" mc:Ignorable="w14 w15 w16se w16cid w16 w16cex w16sdtdh w16sdtfl w16du wp14">
+<w:ftr xmlns:wpc="http://schemas.microsoft.com/office/word/2010/wordprocessingCanvas" xmlns:cx="http://schemas.microsoft.com/office/drawing/2014/chartex" xmlns:cx1="http://schemas.microsoft.com/office/drawing/2015/9/8/chartex" xmlns:cx2="http://schemas.microsoft.com/office/drawing/2015/10/21/chartex" xmlns:cx3="http://schemas.microsoft.com/office/drawing/2016/5/9/chartex" xmlns:cx4="http://schemas.microsoft.com/office/drawing/2016/5/10/chartex" xmlns:cx5="http://schemas.microsoft.com/office/drawing/2016/5/11/chartex" xmlns:cx6="http://schemas.microsoft.com/office/drawing/2016/5/12/chartex" xmlns:cx7="http://schemas.microsoft.com/office/drawing/2016/5/13/chartex" xmlns:cx8="http://schemas.microsoft.com/office/drawing/2016/5/14/chartex" xmlns:mc="http://schemas.openxmlformats.org/markup-compatibility/2006" xmlns:m="http://schemas.openxmlformats.org/officeDocument/2006/math" xmlns:aink="http://schemas.microsoft.com/office/drawing/2016/ink" xmlns:am3d="http://schemas.microsoft.com/office/drawing/2017/model3d" xmlns:oel="http://schemas.microsoft.com/office/2019/extlst" xmlns:r="http://schemas.openxmlformats.org/officeDocument/2006/relationships" xmlns:wp14="http://schemas.microsoft.com/office/word/2010/wordprocessingDrawing" xmlns:wp="http://schemas.openxmlformats.org/drawingml/2006/wordprocessingDrawing" xmlns:wpg="http://schemas.microsoft.com/office/word/2010/wordprocessingGroup" xmlns:wpi="http://schemas.microsoft.com/office/word/2010/wordprocessingInk" xmlns:wps="http://schemas.microsoft.com/office/word/2010/wordprocessingShape" xmlns:o="urn:schemas-microsoft-com:office:office" xmlns:v="urn:schemas-microsoft-com:vml" xmlns:w10="urn:schemas-microsoft-com:office:word" xmlns:w="http://schemas.openxmlformats.org/wordprocessingml/2006/main" xmlns:w14="http://schemas.microsoft.com/office/word/2010/wordml" xmlns:w15="http://schemas.microsoft.com/office/word/2012/wordml" xmlns:w16cex="http://schemas.microsoft.com/office/word/2018/wordml/cex" xmlns:w16cid="http://schemas.microsoft.com/office/word/2016/wordml/cid" xmlns:w16="http://schemas.microsoft.com/office/word/2018/wordml" xmlns:w16sdtdh="http://schemas.microsoft.com/office/word/2020/wordml/sdtdatahash" xmlns:w16sdtfl="http://schemas.microsoft.com/office/word/2024/wordml/sdtformatlock" xmlns:w16se="http://schemas.microsoft.com/office/word/2015/wordml/symex" xmlns:w16du="http://schemas.microsoft.com/office/word/2023/wordml/word16du" xmlns:wne="http://schemas.microsoft.com/office/word/2006/wordml" mc:Ignorable="w14 w15 w16se w16cid w16 w16cex w16sdtdh w16sdtfl w16du wp14">
   <w:sdt>
     <w:sdtPr>
       <w:rPr>
@@ -399,7 +412,7 @@
 </file>
 
 <file path=word/footer2.xml><?xml version="1.0" encoding="utf-8"?>
-<w:ftr xmlns:wpc="http://schemas.microsoft.com/office/word/2010/wordprocessingCanvas" xmlns:cx="http://schemas.microsoft.com/office/drawing/2014/chartex" xmlns:cx1="http://schemas.microsoft.com/office/drawing/2015/9/8/chartex" xmlns:cx2="http://schemas.microsoft.com/office/drawing/2015/10/21/chartex" xmlns:cx3="http://schemas.microsoft.com/office/drawing/2016/5/9/chartex" xmlns:cx4="http://schemas.microsoft.com/office/drawing/2016/5/10/chartex" xmlns:cx5="http://schemas.microsoft.com/office/drawing/2016/5/11/chartex" xmlns:cx6="http://schemas.microsoft.com/office/drawing/2016/5/12/chartex" xmlns:cx7="http://schemas.microsoft.com/office/drawing/2016/5/13/chartex" xmlns:cx8="http://schemas.microsoft.com/office/drawing/2016/5/14/chartex" xmlns:mc="http://schemas.openxmlformats.org/markup-compatibility/2006" xmlns:aink="http://schemas.microsoft.com/office/drawing/2016/ink" xmlns:am3d="http://schemas.microsoft.com/office/drawing/2017/model3d" xmlns:o="urn:schemas-microsoft-com:office:office" xmlns:oel="http://schemas.microsoft.com/office/2019/extlst" xmlns:r="http://schemas.openxmlformats.org/officeDocument/2006/relationships" xmlns:m="http://schemas.openxmlformats.org/officeDocument/2006/math" xmlns:v="urn:schemas-microsoft-com:vml" xmlns:wp14="http://schemas.microsoft.com/office/word/2010/wordprocessingDrawing" xmlns:wp="http://schemas.openxmlformats.org/drawingml/2006/wordprocessingDrawing" xmlns:w10="urn:schemas-microsoft-com:office:word" xmlns:w="http://schemas.openxmlformats.org/wordprocessingml/2006/main" xmlns:w14="http://schemas.microsoft.com/office/word/2010/wordml" xmlns:w15="http://schemas.microsoft.com/office/word/2012/wordml" xmlns:w16cex="http://schemas.microsoft.com/office/word/2018/wordml/cex" xmlns:w16cid="http://schemas.microsoft.com/office/word/2016/wordml/cid" xmlns:w16="http://schemas.microsoft.com/office/word/2018/wordml" xmlns:w16du="http://schemas.microsoft.com/office/word/2023/wordml/word16du" xmlns:w16sdtdh="http://schemas.microsoft.com/office/word/2020/wordml/sdtdatahash" xmlns:w16sdtfl="http://schemas.microsoft.com/office/word/2024/wordml/sdtformatlock" xmlns:w16se="http://schemas.microsoft.com/office/word/2015/wordml/symex" xmlns:wpg="http://schemas.microsoft.com/office/word/2010/wordprocessingGroup" xmlns:wpi="http://schemas.microsoft.com/office/word/2010/wordprocessingInk" xmlns:wne="http://schemas.microsoft.com/office/word/2006/wordml" xmlns:wps="http://schemas.microsoft.com/office/word/2010/wordprocessingShape" mc:Ignorable="w14 w15 w16se w16cid w16 w16cex w16sdtdh w16sdtfl w16du wp14">
+<w:ftr xmlns:wpc="http://schemas.microsoft.com/office/word/2010/wordprocessingCanvas" xmlns:cx="http://schemas.microsoft.com/office/drawing/2014/chartex" xmlns:cx1="http://schemas.microsoft.com/office/drawing/2015/9/8/chartex" xmlns:cx2="http://schemas.microsoft.com/office/drawing/2015/10/21/chartex" xmlns:cx3="http://schemas.microsoft.com/office/drawing/2016/5/9/chartex" xmlns:cx4="http://schemas.microsoft.com/office/drawing/2016/5/10/chartex" xmlns:cx5="http://schemas.microsoft.com/office/drawing/2016/5/11/chartex" xmlns:cx6="http://schemas.microsoft.com/office/drawing/2016/5/12/chartex" xmlns:cx7="http://schemas.microsoft.com/office/drawing/2016/5/13/chartex" xmlns:cx8="http://schemas.microsoft.com/office/drawing/2016/5/14/chartex" xmlns:mc="http://schemas.openxmlformats.org/markup-compatibility/2006" xmlns:m="http://schemas.openxmlformats.org/officeDocument/2006/math" xmlns:aink="http://schemas.microsoft.com/office/drawing/2016/ink" xmlns:am3d="http://schemas.microsoft.com/office/drawing/2017/model3d" xmlns:oel="http://schemas.microsoft.com/office/2019/extlst" xmlns:r="http://schemas.openxmlformats.org/officeDocument/2006/relationships" xmlns:wp14="http://schemas.microsoft.com/office/word/2010/wordprocessingDrawing" xmlns:wp="http://schemas.openxmlformats.org/drawingml/2006/wordprocessingDrawing" xmlns:wpg="http://schemas.microsoft.com/office/word/2010/wordprocessingGroup" xmlns:wpi="http://schemas.microsoft.com/office/word/2010/wordprocessingInk" xmlns:wps="http://schemas.microsoft.com/office/word/2010/wordprocessingShape" xmlns:o="urn:schemas-microsoft-com:office:office" xmlns:v="urn:schemas-microsoft-com:vml" xmlns:w10="urn:schemas-microsoft-com:office:word" xmlns:w="http://schemas.openxmlformats.org/wordprocessingml/2006/main" xmlns:w14="http://schemas.microsoft.com/office/word/2010/wordml" xmlns:w15="http://schemas.microsoft.com/office/word/2012/wordml" xmlns:w16cex="http://schemas.microsoft.com/office/word/2018/wordml/cex" xmlns:w16cid="http://schemas.microsoft.com/office/word/2016/wordml/cid" xmlns:w16="http://schemas.microsoft.com/office/word/2018/wordml" xmlns:w16sdtdh="http://schemas.microsoft.com/office/word/2020/wordml/sdtdatahash" xmlns:w16sdtfl="http://schemas.microsoft.com/office/word/2024/wordml/sdtformatlock" xmlns:w16se="http://schemas.microsoft.com/office/word/2015/wordml/symex" xmlns:w16du="http://schemas.microsoft.com/office/word/2023/wordml/word16du" xmlns:wne="http://schemas.microsoft.com/office/word/2006/wordml" mc:Ignorable="w14 w15 w16se w16cid w16 w16cex w16sdtdh w16sdtfl w16du wp14">
   <w:p>
     <w:pPr>
       <w:pStyle w:val="Footer"/>
@@ -419,7 +432,7 @@
 </file>
 
 <file path=word/footnotes.xml><?xml version="1.0" encoding="utf-8"?>
-<w:footnotes xmlns:wpc="http://schemas.microsoft.com/office/word/2010/wordprocessingCanvas" xmlns:cx="http://schemas.microsoft.com/office/drawing/2014/chartex" xmlns:cx1="http://schemas.microsoft.com/office/drawing/2015/9/8/chartex" xmlns:cx2="http://schemas.microsoft.com/office/drawing/2015/10/21/chartex" xmlns:cx3="http://schemas.microsoft.com/office/drawing/2016/5/9/chartex" xmlns:cx4="http://schemas.microsoft.com/office/drawing/2016/5/10/chartex" xmlns:cx5="http://schemas.microsoft.com/office/drawing/2016/5/11/chartex" xmlns:cx6="http://schemas.microsoft.com/office/drawing/2016/5/12/chartex" xmlns:cx7="http://schemas.microsoft.com/office/drawing/2016/5/13/chartex" xmlns:cx8="http://schemas.microsoft.com/office/drawing/2016/5/14/chartex" xmlns:mc="http://schemas.openxmlformats.org/markup-compatibility/2006" xmlns:aink="http://schemas.microsoft.com/office/drawing/2016/ink" xmlns:am3d="http://schemas.microsoft.com/office/drawing/2017/model3d" xmlns:o="urn:schemas-microsoft-com:office:office" xmlns:oel="http://schemas.microsoft.com/office/2019/extlst" xmlns:r="http://schemas.openxmlformats.org/officeDocument/2006/relationships" xmlns:m="http://schemas.openxmlformats.org/officeDocument/2006/math" xmlns:v="urn:schemas-microsoft-com:vml" xmlns:wp14="http://schemas.microsoft.com/office/word/2010/wordprocessingDrawing" xmlns:wp="http://schemas.openxmlformats.org/drawingml/2006/wordprocessingDrawing" xmlns:w10="urn:schemas-microsoft-com:office:word" xmlns:w="http://schemas.openxmlformats.org/wordprocessingml/2006/main" xmlns:w14="http://schemas.microsoft.com/office/word/2010/wordml" xmlns:w15="http://schemas.microsoft.com/office/word/2012/wordml" xmlns:w16cex="http://schemas.microsoft.com/office/word/2018/wordml/cex" xmlns:w16cid="http://schemas.microsoft.com/office/word/2016/wordml/cid" xmlns:w16="http://schemas.microsoft.com/office/word/2018/wordml" xmlns:w16du="http://schemas.microsoft.com/office/word/2023/wordml/word16du" xmlns:w16sdtdh="http://schemas.microsoft.com/office/word/2020/wordml/sdtdatahash" xmlns:w16sdtfl="http://schemas.microsoft.com/office/word/2024/wordml/sdtformatlock" xmlns:w16se="http://schemas.microsoft.com/office/word/2015/wordml/symex" xmlns:wpg="http://schemas.microsoft.com/office/word/2010/wordprocessingGroup" xmlns:wpi="http://schemas.microsoft.com/office/word/2010/wordprocessingInk" xmlns:wne="http://schemas.microsoft.com/office/word/2006/wordml" xmlns:wps="http://schemas.microsoft.com/office/word/2010/wordprocessingShape" mc:Ignorable="w14 w15 w16se w16cid w16 w16cex w16sdtdh w16sdtfl w16du wp14">
+<w:footnotes xmlns:wpc="http://schemas.microsoft.com/office/word/2010/wordprocessingCanvas" xmlns:cx="http://schemas.microsoft.com/office/drawing/2014/chartex" xmlns:cx1="http://schemas.microsoft.com/office/drawing/2015/9/8/chartex" xmlns:cx2="http://schemas.microsoft.com/office/drawing/2015/10/21/chartex" xmlns:cx3="http://schemas.microsoft.com/office/drawing/2016/5/9/chartex" xmlns:cx4="http://schemas.microsoft.com/office/drawing/2016/5/10/chartex" xmlns:cx5="http://schemas.microsoft.com/office/drawing/2016/5/11/chartex" xmlns:cx6="http://schemas.microsoft.com/office/drawing/2016/5/12/chartex" xmlns:cx7="http://schemas.microsoft.com/office/drawing/2016/5/13/chartex" xmlns:cx8="http://schemas.microsoft.com/office/drawing/2016/5/14/chartex" xmlns:mc="http://schemas.openxmlformats.org/markup-compatibility/2006" xmlns:m="http://schemas.openxmlformats.org/officeDocument/2006/math" xmlns:aink="http://schemas.microsoft.com/office/drawing/2016/ink" xmlns:am3d="http://schemas.microsoft.com/office/drawing/2017/model3d" xmlns:oel="http://schemas.microsoft.com/office/2019/extlst" xmlns:r="http://schemas.openxmlformats.org/officeDocument/2006/relationships" xmlns:wp14="http://schemas.microsoft.com/office/word/2010/wordprocessingDrawing" xmlns:wp="http://schemas.openxmlformats.org/drawingml/2006/wordprocessingDrawing" xmlns:wpg="http://schemas.microsoft.com/office/word/2010/wordprocessingGroup" xmlns:wpi="http://schemas.microsoft.com/office/word/2010/wordprocessingInk" xmlns:wps="http://schemas.microsoft.com/office/word/2010/wordprocessingShape" xmlns:o="urn:schemas-microsoft-com:office:office" xmlns:v="urn:schemas-microsoft-com:vml" xmlns:w10="urn:schemas-microsoft-com:office:word" xmlns:w="http://schemas.openxmlformats.org/wordprocessingml/2006/main" xmlns:w14="http://schemas.microsoft.com/office/word/2010/wordml" xmlns:w15="http://schemas.microsoft.com/office/word/2012/wordml" xmlns:w16cex="http://schemas.microsoft.com/office/word/2018/wordml/cex" xmlns:w16cid="http://schemas.microsoft.com/office/word/2016/wordml/cid" xmlns:w16="http://schemas.microsoft.com/office/word/2018/wordml" xmlns:w16sdtdh="http://schemas.microsoft.com/office/word/2020/wordml/sdtdatahash" xmlns:w16sdtfl="http://schemas.microsoft.com/office/word/2024/wordml/sdtformatlock" xmlns:w16se="http://schemas.microsoft.com/office/word/2015/wordml/symex" xmlns:w16du="http://schemas.microsoft.com/office/word/2023/wordml/word16du" xmlns:wne="http://schemas.microsoft.com/office/word/2006/wordml" mc:Ignorable="w14 w15 w16se w16cid w16 w16cex w16sdtdh w16sdtfl w16du wp14">
   <w:footnote w:type="separator" w:id="-1">
     <w:p>
       <w:r>
@@ -454,7 +467,7 @@
 </file>
 
 <file path=word/header1.xml><?xml version="1.0" encoding="utf-8"?>
-<w:hdr xmlns:wpc="http://schemas.microsoft.com/office/word/2010/wordprocessingCanvas" xmlns:cx="http://schemas.microsoft.com/office/drawing/2014/chartex" xmlns:cx1="http://schemas.microsoft.com/office/drawing/2015/9/8/chartex" xmlns:cx2="http://schemas.microsoft.com/office/drawing/2015/10/21/chartex" xmlns:cx3="http://schemas.microsoft.com/office/drawing/2016/5/9/chartex" xmlns:cx4="http://schemas.microsoft.com/office/drawing/2016/5/10/chartex" xmlns:cx5="http://schemas.microsoft.com/office/drawing/2016/5/11/chartex" xmlns:cx6="http://schemas.microsoft.com/office/drawing/2016/5/12/chartex" xmlns:cx7="http://schemas.microsoft.com/office/drawing/2016/5/13/chartex" xmlns:cx8="http://schemas.microsoft.com/office/drawing/2016/5/14/chartex" xmlns:mc="http://schemas.openxmlformats.org/markup-compatibility/2006" xmlns:aink="http://schemas.microsoft.com/office/drawing/2016/ink" xmlns:am3d="http://schemas.microsoft.com/office/drawing/2017/model3d" xmlns:o="urn:schemas-microsoft-com:office:office" xmlns:oel="http://schemas.microsoft.com/office/2019/extlst" xmlns:r="http://schemas.openxmlformats.org/officeDocument/2006/relationships" xmlns:m="http://schemas.openxmlformats.org/officeDocument/2006/math" xmlns:v="urn:schemas-microsoft-com:vml" xmlns:wp14="http://schemas.microsoft.com/office/word/2010/wordprocessingDrawing" xmlns:wp="http://schemas.openxmlformats.org/drawingml/2006/wordprocessingDrawing" xmlns:w10="urn:schemas-microsoft-com:office:word" xmlns:w="http://schemas.openxmlformats.org/wordprocessingml/2006/main" xmlns:w14="http://schemas.microsoft.com/office/word/2010/wordml" xmlns:w15="http://schemas.microsoft.com/office/word/2012/wordml" xmlns:w16cex="http://schemas.microsoft.com/office/word/2018/wordml/cex" xmlns:w16cid="http://schemas.microsoft.com/office/word/2016/wordml/cid" xmlns:w16="http://schemas.microsoft.com/office/word/2018/wordml" xmlns:w16du="http://schemas.microsoft.com/office/word/2023/wordml/word16du" xmlns:w16sdtdh="http://schemas.microsoft.com/office/word/2020/wordml/sdtdatahash" xmlns:w16sdtfl="http://schemas.microsoft.com/office/word/2024/wordml/sdtformatlock" xmlns:w16se="http://schemas.microsoft.com/office/word/2015/wordml/symex" xmlns:wpg="http://schemas.microsoft.com/office/word/2010/wordprocessingGroup" xmlns:wpi="http://schemas.microsoft.com/office/word/2010/wordprocessingInk" xmlns:wne="http://schemas.microsoft.com/office/word/2006/wordml" xmlns:wps="http://schemas.microsoft.com/office/word/2010/wordprocessingShape" mc:Ignorable="w14 w15 w16se w16cid w16 w16cex w16sdtdh w16sdtfl w16du wp14">
+<w:hdr xmlns:wpc="http://schemas.microsoft.com/office/word/2010/wordprocessingCanvas" xmlns:cx="http://schemas.microsoft.com/office/drawing/2014/chartex" xmlns:cx1="http://schemas.microsoft.com/office/drawing/2015/9/8/chartex" xmlns:cx2="http://schemas.microsoft.com/office/drawing/2015/10/21/chartex" xmlns:cx3="http://schemas.microsoft.com/office/drawing/2016/5/9/chartex" xmlns:cx4="http://schemas.microsoft.com/office/drawing/2016/5/10/chartex" xmlns:cx5="http://schemas.microsoft.com/office/drawing/2016/5/11/chartex" xmlns:cx6="http://schemas.microsoft.com/office/drawing/2016/5/12/chartex" xmlns:cx7="http://schemas.microsoft.com/office/drawing/2016/5/13/chartex" xmlns:cx8="http://schemas.microsoft.com/office/drawing/2016/5/14/chartex" xmlns:mc="http://schemas.openxmlformats.org/markup-compatibility/2006" xmlns:m="http://schemas.openxmlformats.org/officeDocument/2006/math" xmlns:aink="http://schemas.microsoft.com/office/drawing/2016/ink" xmlns:am3d="http://schemas.microsoft.com/office/drawing/2017/model3d" xmlns:oel="http://schemas.microsoft.com/office/2019/extlst" xmlns:r="http://schemas.openxmlformats.org/officeDocument/2006/relationships" xmlns:wp14="http://schemas.microsoft.com/office/word/2010/wordprocessingDrawing" xmlns:wp="http://schemas.openxmlformats.org/drawingml/2006/wordprocessingDrawing" xmlns:wpg="http://schemas.microsoft.com/office/word/2010/wordprocessingGroup" xmlns:wpi="http://schemas.microsoft.com/office/word/2010/wordprocessingInk" xmlns:wps="http://schemas.microsoft.com/office/word/2010/wordprocessingShape" xmlns:o="urn:schemas-microsoft-com:office:office" xmlns:v="urn:schemas-microsoft-com:vml" xmlns:w10="urn:schemas-microsoft-com:office:word" xmlns:w="http://schemas.openxmlformats.org/wordprocessingml/2006/main" xmlns:w14="http://schemas.microsoft.com/office/word/2010/wordml" xmlns:w15="http://schemas.microsoft.com/office/word/2012/wordml" xmlns:w16cex="http://schemas.microsoft.com/office/word/2018/wordml/cex" xmlns:w16cid="http://schemas.microsoft.com/office/word/2016/wordml/cid" xmlns:w16="http://schemas.microsoft.com/office/word/2018/wordml" xmlns:w16sdtdh="http://schemas.microsoft.com/office/word/2020/wordml/sdtdatahash" xmlns:w16sdtfl="http://schemas.microsoft.com/office/word/2024/wordml/sdtformatlock" xmlns:w16se="http://schemas.microsoft.com/office/word/2015/wordml/symex" xmlns:w16du="http://schemas.microsoft.com/office/word/2023/wordml/word16du" xmlns:wne="http://schemas.microsoft.com/office/word/2006/wordml" mc:Ignorable="w14 w15 w16se w16cid w16 w16cex w16sdtdh w16sdtfl w16du wp14">
   <w:sdt>
     <w:sdtPr>
       <w:rPr>
@@ -512,7 +525,7 @@
 </file>
 
 <file path=word/header2.xml><?xml version="1.0" encoding="utf-8"?>
-<w:hdr xmlns:wpc="http://schemas.microsoft.com/office/word/2010/wordprocessingCanvas" xmlns:cx="http://schemas.microsoft.com/office/drawing/2014/chartex" xmlns:cx1="http://schemas.microsoft.com/office/drawing/2015/9/8/chartex" xmlns:cx2="http://schemas.microsoft.com/office/drawing/2015/10/21/chartex" xmlns:cx3="http://schemas.microsoft.com/office/drawing/2016/5/9/chartex" xmlns:cx4="http://schemas.microsoft.com/office/drawing/2016/5/10/chartex" xmlns:cx5="http://schemas.microsoft.com/office/drawing/2016/5/11/chartex" xmlns:cx6="http://schemas.microsoft.com/office/drawing/2016/5/12/chartex" xmlns:cx7="http://schemas.microsoft.com/office/drawing/2016/5/13/chartex" xmlns:cx8="http://schemas.microsoft.com/office/drawing/2016/5/14/chartex" xmlns:mc="http://schemas.openxmlformats.org/markup-compatibility/2006" xmlns:aink="http://schemas.microsoft.com/office/drawing/2016/ink" xmlns:am3d="http://schemas.microsoft.com/office/drawing/2017/model3d" xmlns:o="urn:schemas-microsoft-com:office:office" xmlns:oel="http://schemas.microsoft.com/office/2019/extlst" xmlns:r="http://schemas.openxmlformats.org/officeDocument/2006/relationships" xmlns:m="http://schemas.openxmlformats.org/officeDocument/2006/math" xmlns:v="urn:schemas-microsoft-com:vml" xmlns:wp14="http://schemas.microsoft.com/office/word/2010/wordprocessingDrawing" xmlns:wp="http://schemas.openxmlformats.org/drawingml/2006/wordprocessingDrawing" xmlns:w10="urn:schemas-microsoft-com:office:word" xmlns:w="http://schemas.openxmlformats.org/wordprocessingml/2006/main" xmlns:w14="http://schemas.microsoft.com/office/word/2010/wordml" xmlns:w15="http://schemas.microsoft.com/office/word/2012/wordml" xmlns:w16cex="http://schemas.microsoft.com/office/word/2018/wordml/cex" xmlns:w16cid="http://schemas.microsoft.com/office/word/2016/wordml/cid" xmlns:w16="http://schemas.microsoft.com/office/word/2018/wordml" xmlns:w16du="http://schemas.microsoft.com/office/word/2023/wordml/word16du" xmlns:w16sdtdh="http://schemas.microsoft.com/office/word/2020/wordml/sdtdatahash" xmlns:w16sdtfl="http://schemas.microsoft.com/office/word/2024/wordml/sdtformatlock" xmlns:w16se="http://schemas.microsoft.com/office/word/2015/wordml/symex" xmlns:wpg="http://schemas.microsoft.com/office/word/2010/wordprocessingGroup" xmlns:wpi="http://schemas.microsoft.com/office/word/2010/wordprocessingInk" xmlns:wne="http://schemas.microsoft.com/office/word/2006/wordml" xmlns:wps="http://schemas.microsoft.com/office/word/2010/wordprocessingShape" mc:Ignorable="w14 w15 w16se w16cid w16 w16cex w16sdtdh w16sdtfl w16du wp14">
+<w:hdr xmlns:wpc="http://schemas.microsoft.com/office/word/2010/wordprocessingCanvas" xmlns:cx="http://schemas.microsoft.com/office/drawing/2014/chartex" xmlns:cx1="http://schemas.microsoft.com/office/drawing/2015/9/8/chartex" xmlns:cx2="http://schemas.microsoft.com/office/drawing/2015/10/21/chartex" xmlns:cx3="http://schemas.microsoft.com/office/drawing/2016/5/9/chartex" xmlns:cx4="http://schemas.microsoft.com/office/drawing/2016/5/10/chartex" xmlns:cx5="http://schemas.microsoft.com/office/drawing/2016/5/11/chartex" xmlns:cx6="http://schemas.microsoft.com/office/drawing/2016/5/12/chartex" xmlns:cx7="http://schemas.microsoft.com/office/drawing/2016/5/13/chartex" xmlns:cx8="http://schemas.microsoft.com/office/drawing/2016/5/14/chartex" xmlns:mc="http://schemas.openxmlformats.org/markup-compatibility/2006" xmlns:m="http://schemas.openxmlformats.org/officeDocument/2006/math" xmlns:aink="http://schemas.microsoft.com/office/drawing/2016/ink" xmlns:am3d="http://schemas.microsoft.com/office/drawing/2017/model3d" xmlns:oel="http://schemas.microsoft.com/office/2019/extlst" xmlns:r="http://schemas.openxmlformats.org/officeDocument/2006/relationships" xmlns:wp14="http://schemas.microsoft.com/office/word/2010/wordprocessingDrawing" xmlns:wp="http://schemas.openxmlformats.org/drawingml/2006/wordprocessingDrawing" xmlns:wpg="http://schemas.microsoft.com/office/word/2010/wordprocessingGroup" xmlns:wpi="http://schemas.microsoft.com/office/word/2010/wordprocessingInk" xmlns:wps="http://schemas.microsoft.com/office/word/2010/wordprocessingShape" xmlns:o="urn:schemas-microsoft-com:office:office" xmlns:v="urn:schemas-microsoft-com:vml" xmlns:w10="urn:schemas-microsoft-com:office:word" xmlns:w="http://schemas.openxmlformats.org/wordprocessingml/2006/main" xmlns:w14="http://schemas.microsoft.com/office/word/2010/wordml" xmlns:w15="http://schemas.microsoft.com/office/word/2012/wordml" xmlns:w16cex="http://schemas.microsoft.com/office/word/2018/wordml/cex" xmlns:w16cid="http://schemas.microsoft.com/office/word/2016/wordml/cid" xmlns:w16="http://schemas.microsoft.com/office/word/2018/wordml" xmlns:w16sdtdh="http://schemas.microsoft.com/office/word/2020/wordml/sdtdatahash" xmlns:w16sdtfl="http://schemas.microsoft.com/office/word/2024/wordml/sdtformatlock" xmlns:w16se="http://schemas.microsoft.com/office/word/2015/wordml/symex" xmlns:w16du="http://schemas.microsoft.com/office/word/2023/wordml/word16du" xmlns:wne="http://schemas.microsoft.com/office/word/2006/wordml" mc:Ignorable="w14 w15 w16se w16cid w16 w16cex w16sdtdh w16sdtfl w16du wp14">
   <w:sdt>
     <w:sdtPr>
       <w:rPr>
@@ -588,7 +601,7 @@
 </file>
 
 <file path=word/numbering.xml><?xml version="1.0" encoding="utf-8"?>
-<w:numbering xmlns:wpc="http://schemas.microsoft.com/office/word/2010/wordprocessingCanvas" xmlns:cx="http://schemas.microsoft.com/office/drawing/2014/chartex" xmlns:cx1="http://schemas.microsoft.com/office/drawing/2015/9/8/chartex" xmlns:cx2="http://schemas.microsoft.com/office/drawing/2015/10/21/chartex" xmlns:cx3="http://schemas.microsoft.com/office/drawing/2016/5/9/chartex" xmlns:cx4="http://schemas.microsoft.com/office/drawing/2016/5/10/chartex" xmlns:cx5="http://schemas.microsoft.com/office/drawing/2016/5/11/chartex" xmlns:cx6="http://schemas.microsoft.com/office/drawing/2016/5/12/chartex" xmlns:cx7="http://schemas.microsoft.com/office/drawing/2016/5/13/chartex" xmlns:cx8="http://schemas.microsoft.com/office/drawing/2016/5/14/chartex" xmlns:mc="http://schemas.openxmlformats.org/markup-compatibility/2006" xmlns:aink="http://schemas.microsoft.com/office/drawing/2016/ink" xmlns:am3d="http://schemas.microsoft.com/office/drawing/2017/model3d" xmlns:o="urn:schemas-microsoft-com:office:office" xmlns:oel="http://schemas.microsoft.com/office/2019/extlst" xmlns:r="http://schemas.openxmlformats.org/officeDocument/2006/relationships" xmlns:m="http://schemas.openxmlformats.org/officeDocument/2006/math" xmlns:v="urn:schemas-microsoft-com:vml" xmlns:wp14="http://schemas.microsoft.com/office/word/2010/wordprocessingDrawing" xmlns:wp="http://schemas.openxmlformats.org/drawingml/2006/wordprocessingDrawing" xmlns:w10="urn:schemas-microsoft-com:office:word" xmlns:w="http://schemas.openxmlformats.org/wordprocessingml/2006/main" xmlns:w14="http://schemas.microsoft.com/office/word/2010/wordml" xmlns:w15="http://schemas.microsoft.com/office/word/2012/wordml" xmlns:w16cex="http://schemas.microsoft.com/office/word/2018/wordml/cex" xmlns:w16cid="http://schemas.microsoft.com/office/word/2016/wordml/cid" xmlns:w16="http://schemas.microsoft.com/office/word/2018/wordml" xmlns:w16du="http://schemas.microsoft.com/office/word/2023/wordml/word16du" xmlns:w16sdtdh="http://schemas.microsoft.com/office/word/2020/wordml/sdtdatahash" xmlns:w16sdtfl="http://schemas.microsoft.com/office/word/2024/wordml/sdtformatlock" xmlns:w16se="http://schemas.microsoft.com/office/word/2015/wordml/symex" xmlns:wpg="http://schemas.microsoft.com/office/word/2010/wordprocessingGroup" xmlns:wpi="http://schemas.microsoft.com/office/word/2010/wordprocessingInk" xmlns:wne="http://schemas.microsoft.com/office/word/2006/wordml" xmlns:wps="http://schemas.microsoft.com/office/word/2010/wordprocessingShape" mc:Ignorable="w14 w15 w16se w16cid w16 w16cex w16sdtdh w16sdtfl w16du wp14">
+<w:numbering xmlns:wpc="http://schemas.microsoft.com/office/word/2010/wordprocessingCanvas" xmlns:cx="http://schemas.microsoft.com/office/drawing/2014/chartex" xmlns:cx1="http://schemas.microsoft.com/office/drawing/2015/9/8/chartex" xmlns:cx2="http://schemas.microsoft.com/office/drawing/2015/10/21/chartex" xmlns:cx3="http://schemas.microsoft.com/office/drawing/2016/5/9/chartex" xmlns:cx4="http://schemas.microsoft.com/office/drawing/2016/5/10/chartex" xmlns:cx5="http://schemas.microsoft.com/office/drawing/2016/5/11/chartex" xmlns:cx6="http://schemas.microsoft.com/office/drawing/2016/5/12/chartex" xmlns:cx7="http://schemas.microsoft.com/office/drawing/2016/5/13/chartex" xmlns:cx8="http://schemas.microsoft.com/office/drawing/2016/5/14/chartex" xmlns:mc="http://schemas.openxmlformats.org/markup-compatibility/2006" xmlns:m="http://schemas.openxmlformats.org/officeDocument/2006/math" xmlns:aink="http://schemas.microsoft.com/office/drawing/2016/ink" xmlns:am3d="http://schemas.microsoft.com/office/drawing/2017/model3d" xmlns:oel="http://schemas.microsoft.com/office/2019/extlst" xmlns:r="http://schemas.openxmlformats.org/officeDocument/2006/relationships" xmlns:wp14="http://schemas.microsoft.com/office/word/2010/wordprocessingDrawing" xmlns:wp="http://schemas.openxmlformats.org/drawingml/2006/wordprocessingDrawing" xmlns:wpg="http://schemas.microsoft.com/office/word/2010/wordprocessingGroup" xmlns:wpi="http://schemas.microsoft.com/office/word/2010/wordprocessingInk" xmlns:wps="http://schemas.microsoft.com/office/word/2010/wordprocessingShape" xmlns:o="urn:schemas-microsoft-com:office:office" xmlns:v="urn:schemas-microsoft-com:vml" xmlns:w10="urn:schemas-microsoft-com:office:word" xmlns:w="http://schemas.openxmlformats.org/wordprocessingml/2006/main" xmlns:w14="http://schemas.microsoft.com/office/word/2010/wordml" xmlns:w15="http://schemas.microsoft.com/office/word/2012/wordml" xmlns:w16cex="http://schemas.microsoft.com/office/word/2018/wordml/cex" xmlns:w16cid="http://schemas.microsoft.com/office/word/2016/wordml/cid" xmlns:w16="http://schemas.microsoft.com/office/word/2018/wordml" xmlns:w16sdtdh="http://schemas.microsoft.com/office/word/2020/wordml/sdtdatahash" xmlns:w16sdtfl="http://schemas.microsoft.com/office/word/2024/wordml/sdtformatlock" xmlns:w16se="http://schemas.microsoft.com/office/word/2015/wordml/symex" xmlns:w16du="http://schemas.microsoft.com/office/word/2023/wordml/word16du" xmlns:wne="http://schemas.microsoft.com/office/word/2006/wordml" mc:Ignorable="w14 w15 w16se w16cid w16 w16cex w16sdtdh w16sdtfl w16du wp14">
   <w:abstractNum w:abstractNumId="0" w15:restartNumberingAfterBreak="0">
     <w:nsid w:val="170CD2DE"/>
     <w:multiLevelType w:val="multilevel"/>
@@ -700,7 +713,7 @@
 </file>
 
 <file path=word/styles.xml><?xml version="1.0" encoding="utf-8"?>
-<w:styles xmlns:mc="http://schemas.openxmlformats.org/markup-compatibility/2006" xmlns:r="http://schemas.openxmlformats.org/officeDocument/2006/relationships" xmlns:w="http://schemas.openxmlformats.org/wordprocessingml/2006/main" xmlns:w14="http://schemas.microsoft.com/office/word/2010/wordml" xmlns:w15="http://schemas.microsoft.com/office/word/2012/wordml" xmlns:w16cex="http://schemas.microsoft.com/office/word/2018/wordml/cex" xmlns:w16cid="http://schemas.microsoft.com/office/word/2016/wordml/cid" xmlns:w16="http://schemas.microsoft.com/office/word/2018/wordml" xmlns:w16du="http://schemas.microsoft.com/office/word/2023/wordml/word16du" xmlns:w16sdtdh="http://schemas.microsoft.com/office/word/2020/wordml/sdtdatahash" xmlns:w16sdtfl="http://schemas.microsoft.com/office/word/2024/wordml/sdtformatlock" xmlns:w16se="http://schemas.microsoft.com/office/word/2015/wordml/symex" mc:Ignorable="w14 w15 w16se w16cid w16 w16cex w16sdtdh w16sdtfl w16du">
+<w:styles xmlns:mc="http://schemas.openxmlformats.org/markup-compatibility/2006" xmlns:r="http://schemas.openxmlformats.org/officeDocument/2006/relationships" xmlns:w="http://schemas.openxmlformats.org/wordprocessingml/2006/main" xmlns:w14="http://schemas.microsoft.com/office/word/2010/wordml" xmlns:w15="http://schemas.microsoft.com/office/word/2012/wordml" xmlns:w16cex="http://schemas.microsoft.com/office/word/2018/wordml/cex" xmlns:w16cid="http://schemas.microsoft.com/office/word/2016/wordml/cid" xmlns:w16="http://schemas.microsoft.com/office/word/2018/wordml" xmlns:w16sdtdh="http://schemas.microsoft.com/office/word/2020/wordml/sdtdatahash" xmlns:w16sdtfl="http://schemas.microsoft.com/office/word/2024/wordml/sdtformatlock" xmlns:w16se="http://schemas.microsoft.com/office/word/2015/wordml/symex" xmlns:w16du="http://schemas.microsoft.com/office/word/2023/wordml/word16du" mc:Ignorable="w14 w15 w16se w16cid w16 w16cex w16sdtdh w16sdtfl w16du">
   <w:docDefaults>
     <w:rPrDefault>
       <w:rPr>
@@ -963,9 +976,9 @@
   <w:style w:type="paragraph" w:default="1" w:styleId="Normal">
     <w:name w:val="Normal"/>
     <w:qFormat/>
-    <w:rsid w:val="008E522C"/>
-    <w:pPr>
-      <w:spacing w:after="100"/>
+    <w:rsid w:val="00A314E0"/>
+    <w:pPr>
+      <w:spacing w:after="100" w:line="360" w:lineRule="auto"/>
     </w:pPr>
     <w:rPr>
       <w:rFonts w:ascii="Century Schoolbook" w:hAnsi="Century Schoolbook"/>
@@ -1408,10 +1421,10 @@
   <w:style w:type="character" w:styleId="Hyperlink">
     <w:name w:val="Hyperlink"/>
     <w:basedOn w:val="CaptionChar"/>
-    <w:rsid w:val="00DD4A21"/>
+    <w:rsid w:val="00604132"/>
     <w:rPr>
       <w:color w:val="000000" w:themeColor="text1"/>
-      <w:u w:val="dotted"/>
+      <w:u w:val="dotted" w:color="D9D9D9" w:themeColor="background1" w:themeShade="D9"/>
     </w:rPr>
   </w:style>
   <w:style w:type="paragraph" w:styleId="TOCHeading">

</xml_diff>

<commit_message>
Revise CV markdown: header, pubs, service
Replace legacy HTML/CSS/table header with a custom-style contact block and consolidated contact line; add an authorship/contribution note. Reformat and renumber Publications (peer-reviewed, law review, op-eds, reports) with updated links and added items; reorganize Expert Reports/Court Filings section. Restructure Service into “Service to Carnegie Mellon” with CMIST and University subsections and a TODO placeholder. Updated generated PDF and DOCX binaries to reflect these markdown changes.
</commit_message>
<xml_diff>
--- a/cv-reference.docx
+++ b/cv-reference.docx
@@ -982,7 +982,7 @@
     </w:pPr>
     <w:rPr>
       <w:rFonts w:ascii="Century Schoolbook" w:hAnsi="Century Schoolbook"/>
-      <w:sz w:val="20"/>
+      <w:sz w:val="24"/>
     </w:rPr>
   </w:style>
   <w:style w:type="paragraph" w:styleId="Heading1">
@@ -1004,7 +1004,7 @@
       <w:bCs/>
       <w:caps/>
       <w:color w:val="000000" w:themeColor="text1"/>
-      <w:sz w:val="22"/>
+      <w:sz w:val="32"/>
       <w:szCs w:val="32"/>
     </w:rPr>
   </w:style>
@@ -1029,6 +1029,7 @@
       <w:smallCaps/>
       <w:color w:val="000000" w:themeColor="text1"/>
       <w:spacing w:val="-10"/>
+      <w:sz w:val="28"/>
       <w:szCs w:val="28"/>
     </w:rPr>
   </w:style>
@@ -1052,6 +1053,8 @@
       <w:b/>
       <w:bCs/>
       <w:color w:val="000000" w:themeColor="text1"/>
+      <w:sz w:val="26"/>
+      <w:szCs w:val="26"/>
     </w:rPr>
   </w:style>
   <w:style w:type="paragraph" w:styleId="Heading4">
@@ -1493,6 +1496,17 @@
     <w:name w:val="page number"/>
     <w:basedOn w:val="DefaultParagraphFont"/>
     <w:rsid w:val="00861D5D"/>
+  </w:style>
+  <w:style w:type="paragraph" w:customStyle="1" w:styleId="Address">
+    <w:name w:val="Address"/>
+    <w:basedOn w:val="Normal"/>
+    <w:qFormat/>
+    <w:pPr>
+      <w:spacing w:after="0" w:line="240" w:lineRule="auto"/>
+    </w:pPr>
+    <w:rPr>
+      <w:sz w:val="24"/>
+    </w:rPr>
   </w:style>
 </w:styles>
 </file>

</xml_diff>

<commit_message>
Update CV files and trim md whitespace
Replace cv.pdf and cv-reference.docx with updated binary versions and clean up trailing whitespace in cv.md (removed an extra blank/trailing spaces after the dissertation/fields section).
</commit_message>
<xml_diff>
--- a/cv-reference.docx
+++ b/cv-reference.docx
@@ -15,7 +15,15 @@
         <w:pStyle w:val="Subtitle"/>
       </w:pPr>
       <w:r>
-        <w:t xml:space="preserve"> Subtitle </w:t>
+        <w:t xml:space="preserve"> Subtitle</w:t>
+      </w:r>
+    </w:p>
+    <w:p>
+      <w:pPr>
+        <w:pStyle w:val="Address"/>
+      </w:pPr>
+      <w:r>
+        <w:t>Address</w:t>
       </w:r>
     </w:p>
     <w:p>
@@ -145,6 +153,7 @@
         <w:pStyle w:val="BodyText"/>
       </w:pPr>
       <w:r>
+        <w:lastRenderedPageBreak/>
         <w:t xml:space="preserve"> Body Text. Body Text Char.    </w:t>
       </w:r>
       <w:r>
@@ -199,7 +208,6 @@
         <w:pStyle w:val="TableCaption"/>
       </w:pPr>
       <w:r>
-        <w:lastRenderedPageBreak/>
         <w:t xml:space="preserve"> Table caption. </w:t>
       </w:r>
     </w:p>
@@ -211,8 +219,8 @@
         <w:tblCaption w:val="Table caption."/>
       </w:tblPr>
       <w:tblGrid>
-        <w:gridCol w:w="1151"/>
-        <w:gridCol w:w="1151"/>
+        <w:gridCol w:w="1266"/>
+        <w:gridCol w:w="1266"/>
       </w:tblGrid>
       <w:tr>
         <w:trPr>
@@ -982,7 +990,6 @@
     </w:pPr>
     <w:rPr>
       <w:rFonts w:ascii="Century Schoolbook" w:hAnsi="Century Schoolbook"/>
-      <w:sz w:val="24"/>
     </w:rPr>
   </w:style>
   <w:style w:type="paragraph" w:styleId="Heading1">
@@ -1504,9 +1511,6 @@
     <w:pPr>
       <w:spacing w:after="0" w:line="240" w:lineRule="auto"/>
     </w:pPr>
-    <w:rPr>
-      <w:sz w:val="24"/>
-    </w:rPr>
   </w:style>
 </w:styles>
 </file>

</xml_diff>

<commit_message>
Refresh CV content and July 2026 revision
Updates `cv.md` with a July 2026 revision date, reformats education entries, and significantly expands/restructures professional experience (special master/consulting roles, court filings, expert witness work). It also standardizes styling in publication and commentary lists, updates talks/service entries, and regenerates the reference DOCX/PDF outputs to match the new CV content.
</commit_message>
<xml_diff>
--- a/cv-reference.docx
+++ b/cv-reference.docx
@@ -145,7 +145,7 @@
         <w:pStyle w:val="FirstParagraph"/>
       </w:pPr>
       <w:r>
-        <w:t xml:space="preserve"> First Paragraph. </w:t>
+        <w:t xml:space="preserve">First Paragraph. </w:t>
       </w:r>
     </w:p>
     <w:p>
@@ -153,7 +153,6 @@
         <w:pStyle w:val="BodyText"/>
       </w:pPr>
       <w:r>
-        <w:lastRenderedPageBreak/>
         <w:t xml:space="preserve"> Body Text. Body Text Char.    </w:t>
       </w:r>
       <w:r>
@@ -219,8 +218,8 @@
         <w:tblCaption w:val="Table caption."/>
       </w:tblPr>
       <w:tblGrid>
-        <w:gridCol w:w="1266"/>
-        <w:gridCol w:w="1266"/>
+        <w:gridCol w:w="1050"/>
+        <w:gridCol w:w="1050"/>
       </w:tblGrid>
       <w:tr>
         <w:trPr>
@@ -235,7 +234,11 @@
               <w:pStyle w:val="Compact"/>
             </w:pPr>
             <w:r>
-              <w:t xml:space="preserve"> Table </w:t>
+              <w:t xml:space="preserve"> </w:t>
+            </w:r>
+            <w:r>
+              <w:lastRenderedPageBreak/>
+              <w:t xml:space="preserve">Table </w:t>
             </w:r>
           </w:p>
         </w:tc>
@@ -248,7 +251,12 @@
               <w:pStyle w:val="Compact"/>
             </w:pPr>
             <w:r>
-              <w:t xml:space="preserve"> Table </w:t>
+              <w:lastRenderedPageBreak/>
+              <w:t xml:space="preserve"> </w:t>
+            </w:r>
+            <w:r>
+              <w:lastRenderedPageBreak/>
+              <w:t xml:space="preserve">Table </w:t>
             </w:r>
           </w:p>
         </w:tc>
@@ -263,6 +271,7 @@
               <w:pStyle w:val="Compact"/>
             </w:pPr>
             <w:r>
+              <w:lastRenderedPageBreak/>
               <w:t xml:space="preserve"> 1 </w:t>
             </w:r>
           </w:p>
@@ -320,6 +329,47 @@
       </w:pPr>
       <w:r>
         <w:t xml:space="preserve"> Definition </w:t>
+      </w:r>
+    </w:p>
+    <w:p>
+      <w:pPr>
+        <w:pStyle w:val="Definition"/>
+      </w:pPr>
+    </w:p>
+    <w:p>
+      <w:pPr>
+        <w:pStyle w:val="Compact"/>
+        <w:numPr>
+          <w:ilvl w:val="0"/>
+          <w:numId w:val="14"/>
+        </w:numPr>
+      </w:pPr>
+      <w:r>
+        <w:t>Unordered List</w:t>
+      </w:r>
+    </w:p>
+    <w:p>
+      <w:pPr>
+        <w:pStyle w:val="Compact"/>
+        <w:numPr>
+          <w:ilvl w:val="1"/>
+          <w:numId w:val="14"/>
+        </w:numPr>
+      </w:pPr>
+      <w:r>
+        <w:t>Indent one</w:t>
+      </w:r>
+    </w:p>
+    <w:p>
+      <w:pPr>
+        <w:pStyle w:val="Compact"/>
+        <w:numPr>
+          <w:ilvl w:val="2"/>
+          <w:numId w:val="14"/>
+        </w:numPr>
+      </w:pPr>
+      <w:r>
+        <w:t>Indent two</w:t>
       </w:r>
     </w:p>
     <w:sectPr>
@@ -611,6 +661,460 @@
 <file path=word/numbering.xml><?xml version="1.0" encoding="utf-8"?>
 <w:numbering xmlns:wpc="http://schemas.microsoft.com/office/word/2010/wordprocessingCanvas" xmlns:cx="http://schemas.microsoft.com/office/drawing/2014/chartex" xmlns:cx1="http://schemas.microsoft.com/office/drawing/2015/9/8/chartex" xmlns:cx2="http://schemas.microsoft.com/office/drawing/2015/10/21/chartex" xmlns:cx3="http://schemas.microsoft.com/office/drawing/2016/5/9/chartex" xmlns:cx4="http://schemas.microsoft.com/office/drawing/2016/5/10/chartex" xmlns:cx5="http://schemas.microsoft.com/office/drawing/2016/5/11/chartex" xmlns:cx6="http://schemas.microsoft.com/office/drawing/2016/5/12/chartex" xmlns:cx7="http://schemas.microsoft.com/office/drawing/2016/5/13/chartex" xmlns:cx8="http://schemas.microsoft.com/office/drawing/2016/5/14/chartex" xmlns:mc="http://schemas.openxmlformats.org/markup-compatibility/2006" xmlns:m="http://schemas.openxmlformats.org/officeDocument/2006/math" xmlns:aink="http://schemas.microsoft.com/office/drawing/2016/ink" xmlns:am3d="http://schemas.microsoft.com/office/drawing/2017/model3d" xmlns:oel="http://schemas.microsoft.com/office/2019/extlst" xmlns:r="http://schemas.openxmlformats.org/officeDocument/2006/relationships" xmlns:wp14="http://schemas.microsoft.com/office/word/2010/wordprocessingDrawing" xmlns:wp="http://schemas.openxmlformats.org/drawingml/2006/wordprocessingDrawing" xmlns:wpg="http://schemas.microsoft.com/office/word/2010/wordprocessingGroup" xmlns:wpi="http://schemas.microsoft.com/office/word/2010/wordprocessingInk" xmlns:wps="http://schemas.microsoft.com/office/word/2010/wordprocessingShape" xmlns:o="urn:schemas-microsoft-com:office:office" xmlns:v="urn:schemas-microsoft-com:vml" xmlns:w10="urn:schemas-microsoft-com:office:word" xmlns:w="http://schemas.openxmlformats.org/wordprocessingml/2006/main" xmlns:w14="http://schemas.microsoft.com/office/word/2010/wordml" xmlns:w15="http://schemas.microsoft.com/office/word/2012/wordml" xmlns:w16cex="http://schemas.microsoft.com/office/word/2018/wordml/cex" xmlns:w16cid="http://schemas.microsoft.com/office/word/2016/wordml/cid" xmlns:w16="http://schemas.microsoft.com/office/word/2018/wordml" xmlns:w16sdtdh="http://schemas.microsoft.com/office/word/2020/wordml/sdtdatahash" xmlns:w16sdtfl="http://schemas.microsoft.com/office/word/2024/wordml/sdtformatlock" xmlns:w16se="http://schemas.microsoft.com/office/word/2015/wordml/symex" xmlns:w16du="http://schemas.microsoft.com/office/word/2023/wordml/word16du" xmlns:wne="http://schemas.microsoft.com/office/word/2006/wordml" mc:Ignorable="w14 w15 w16se w16cid w16 w16cex w16sdtdh w16sdtfl w16du wp14">
   <w:abstractNum w:abstractNumId="0" w15:restartNumberingAfterBreak="0">
+    <w:nsid w:val="0BF14844"/>
+    <w:multiLevelType w:val="multilevel"/>
+    <w:tmpl w:val="80BE7420"/>
+    <w:styleLink w:val="CurrentList2"/>
+    <w:lvl w:ilvl="0">
+      <w:start w:val="1"/>
+      <w:numFmt w:val="bullet"/>
+      <w:lvlText w:val=""/>
+      <w:lvlJc w:val="left"/>
+      <w:pPr>
+        <w:ind w:left="720" w:hanging="360"/>
+      </w:pPr>
+      <w:rPr>
+        <w:rFonts w:ascii="Symbol" w:hAnsi="Symbol" w:hint="default"/>
+      </w:rPr>
+    </w:lvl>
+    <w:lvl w:ilvl="1">
+      <w:start w:val="1"/>
+      <w:numFmt w:val="bullet"/>
+      <w:lvlText w:val="o"/>
+      <w:lvlJc w:val="left"/>
+      <w:pPr>
+        <w:ind w:left="1440" w:hanging="360"/>
+      </w:pPr>
+      <w:rPr>
+        <w:rFonts w:ascii="Courier New" w:hAnsi="Courier New" w:cs="Courier New" w:hint="default"/>
+      </w:rPr>
+    </w:lvl>
+    <w:lvl w:ilvl="2">
+      <w:start w:val="1"/>
+      <w:numFmt w:val="bullet"/>
+      <w:lvlText w:val=""/>
+      <w:lvlJc w:val="left"/>
+      <w:pPr>
+        <w:ind w:left="2160" w:hanging="360"/>
+      </w:pPr>
+      <w:rPr>
+        <w:rFonts w:ascii="Wingdings" w:hAnsi="Wingdings" w:hint="default"/>
+      </w:rPr>
+    </w:lvl>
+    <w:lvl w:ilvl="3">
+      <w:start w:val="1"/>
+      <w:numFmt w:val="bullet"/>
+      <w:lvlText w:val=""/>
+      <w:lvlJc w:val="left"/>
+      <w:pPr>
+        <w:ind w:left="2880" w:hanging="360"/>
+      </w:pPr>
+      <w:rPr>
+        <w:rFonts w:ascii="Symbol" w:hAnsi="Symbol" w:hint="default"/>
+      </w:rPr>
+    </w:lvl>
+    <w:lvl w:ilvl="4">
+      <w:start w:val="1"/>
+      <w:numFmt w:val="bullet"/>
+      <w:lvlText w:val="o"/>
+      <w:lvlJc w:val="left"/>
+      <w:pPr>
+        <w:ind w:left="3600" w:hanging="360"/>
+      </w:pPr>
+      <w:rPr>
+        <w:rFonts w:ascii="Courier New" w:hAnsi="Courier New" w:cs="Courier New" w:hint="default"/>
+      </w:rPr>
+    </w:lvl>
+    <w:lvl w:ilvl="5">
+      <w:start w:val="1"/>
+      <w:numFmt w:val="bullet"/>
+      <w:lvlText w:val=""/>
+      <w:lvlJc w:val="left"/>
+      <w:pPr>
+        <w:ind w:left="4320" w:hanging="360"/>
+      </w:pPr>
+      <w:rPr>
+        <w:rFonts w:ascii="Wingdings" w:hAnsi="Wingdings" w:hint="default"/>
+      </w:rPr>
+    </w:lvl>
+    <w:lvl w:ilvl="6">
+      <w:start w:val="1"/>
+      <w:numFmt w:val="bullet"/>
+      <w:lvlText w:val=""/>
+      <w:lvlJc w:val="left"/>
+      <w:pPr>
+        <w:ind w:left="5040" w:hanging="360"/>
+      </w:pPr>
+      <w:rPr>
+        <w:rFonts w:ascii="Symbol" w:hAnsi="Symbol" w:hint="default"/>
+      </w:rPr>
+    </w:lvl>
+    <w:lvl w:ilvl="7">
+      <w:start w:val="1"/>
+      <w:numFmt w:val="bullet"/>
+      <w:lvlText w:val="o"/>
+      <w:lvlJc w:val="left"/>
+      <w:pPr>
+        <w:ind w:left="5760" w:hanging="360"/>
+      </w:pPr>
+      <w:rPr>
+        <w:rFonts w:ascii="Courier New" w:hAnsi="Courier New" w:cs="Courier New" w:hint="default"/>
+      </w:rPr>
+    </w:lvl>
+    <w:lvl w:ilvl="8">
+      <w:start w:val="1"/>
+      <w:numFmt w:val="bullet"/>
+      <w:lvlText w:val=""/>
+      <w:lvlJc w:val="left"/>
+      <w:pPr>
+        <w:ind w:left="6480" w:hanging="360"/>
+      </w:pPr>
+      <w:rPr>
+        <w:rFonts w:ascii="Wingdings" w:hAnsi="Wingdings" w:hint="default"/>
+      </w:rPr>
+    </w:lvl>
+  </w:abstractNum>
+  <w:abstractNum w:abstractNumId="1" w15:restartNumberingAfterBreak="0">
+    <w:nsid w:val="0FE15AE2"/>
+    <w:multiLevelType w:val="hybridMultilevel"/>
+    <w:tmpl w:val="B7DE45CA"/>
+    <w:lvl w:ilvl="0" w:tplc="04090001">
+      <w:start w:val="1"/>
+      <w:numFmt w:val="bullet"/>
+      <w:lvlText w:val=""/>
+      <w:lvlJc w:val="left"/>
+      <w:pPr>
+        <w:ind w:left="720" w:hanging="360"/>
+      </w:pPr>
+      <w:rPr>
+        <w:rFonts w:ascii="Symbol" w:hAnsi="Symbol" w:hint="default"/>
+      </w:rPr>
+    </w:lvl>
+    <w:lvl w:ilvl="1" w:tplc="04090003">
+      <w:start w:val="1"/>
+      <w:numFmt w:val="bullet"/>
+      <w:lvlText w:val="o"/>
+      <w:lvlJc w:val="left"/>
+      <w:pPr>
+        <w:ind w:left="1440" w:hanging="360"/>
+      </w:pPr>
+      <w:rPr>
+        <w:rFonts w:ascii="Courier New" w:hAnsi="Courier New" w:cs="Courier New" w:hint="default"/>
+      </w:rPr>
+    </w:lvl>
+    <w:lvl w:ilvl="2" w:tplc="04090005">
+      <w:start w:val="1"/>
+      <w:numFmt w:val="bullet"/>
+      <w:lvlText w:val=""/>
+      <w:lvlJc w:val="left"/>
+      <w:pPr>
+        <w:ind w:left="2160" w:hanging="360"/>
+      </w:pPr>
+      <w:rPr>
+        <w:rFonts w:ascii="Wingdings" w:hAnsi="Wingdings" w:hint="default"/>
+      </w:rPr>
+    </w:lvl>
+    <w:lvl w:ilvl="3" w:tplc="04090001" w:tentative="1">
+      <w:start w:val="1"/>
+      <w:numFmt w:val="bullet"/>
+      <w:lvlText w:val=""/>
+      <w:lvlJc w:val="left"/>
+      <w:pPr>
+        <w:ind w:left="2880" w:hanging="360"/>
+      </w:pPr>
+      <w:rPr>
+        <w:rFonts w:ascii="Symbol" w:hAnsi="Symbol" w:hint="default"/>
+      </w:rPr>
+    </w:lvl>
+    <w:lvl w:ilvl="4" w:tplc="04090003" w:tentative="1">
+      <w:start w:val="1"/>
+      <w:numFmt w:val="bullet"/>
+      <w:lvlText w:val="o"/>
+      <w:lvlJc w:val="left"/>
+      <w:pPr>
+        <w:ind w:left="3600" w:hanging="360"/>
+      </w:pPr>
+      <w:rPr>
+        <w:rFonts w:ascii="Courier New" w:hAnsi="Courier New" w:cs="Courier New" w:hint="default"/>
+      </w:rPr>
+    </w:lvl>
+    <w:lvl w:ilvl="5" w:tplc="04090005" w:tentative="1">
+      <w:start w:val="1"/>
+      <w:numFmt w:val="bullet"/>
+      <w:lvlText w:val=""/>
+      <w:lvlJc w:val="left"/>
+      <w:pPr>
+        <w:ind w:left="4320" w:hanging="360"/>
+      </w:pPr>
+      <w:rPr>
+        <w:rFonts w:ascii="Wingdings" w:hAnsi="Wingdings" w:hint="default"/>
+      </w:rPr>
+    </w:lvl>
+    <w:lvl w:ilvl="6" w:tplc="04090001" w:tentative="1">
+      <w:start w:val="1"/>
+      <w:numFmt w:val="bullet"/>
+      <w:lvlText w:val=""/>
+      <w:lvlJc w:val="left"/>
+      <w:pPr>
+        <w:ind w:left="5040" w:hanging="360"/>
+      </w:pPr>
+      <w:rPr>
+        <w:rFonts w:ascii="Symbol" w:hAnsi="Symbol" w:hint="default"/>
+      </w:rPr>
+    </w:lvl>
+    <w:lvl w:ilvl="7" w:tplc="04090003" w:tentative="1">
+      <w:start w:val="1"/>
+      <w:numFmt w:val="bullet"/>
+      <w:lvlText w:val="o"/>
+      <w:lvlJc w:val="left"/>
+      <w:pPr>
+        <w:ind w:left="5760" w:hanging="360"/>
+      </w:pPr>
+      <w:rPr>
+        <w:rFonts w:ascii="Courier New" w:hAnsi="Courier New" w:cs="Courier New" w:hint="default"/>
+      </w:rPr>
+    </w:lvl>
+    <w:lvl w:ilvl="8" w:tplc="04090005" w:tentative="1">
+      <w:start w:val="1"/>
+      <w:numFmt w:val="bullet"/>
+      <w:lvlText w:val=""/>
+      <w:lvlJc w:val="left"/>
+      <w:pPr>
+        <w:ind w:left="6480" w:hanging="360"/>
+      </w:pPr>
+      <w:rPr>
+        <w:rFonts w:ascii="Wingdings" w:hAnsi="Wingdings" w:hint="default"/>
+      </w:rPr>
+    </w:lvl>
+  </w:abstractNum>
+  <w:abstractNum w:abstractNumId="2" w15:restartNumberingAfterBreak="0">
+    <w:nsid w:val="157320D4"/>
+    <w:multiLevelType w:val="multilevel"/>
+    <w:tmpl w:val="4EBAA02C"/>
+    <w:styleLink w:val="CurrentList1"/>
+    <w:lvl w:ilvl="0">
+      <w:start w:val="1"/>
+      <w:numFmt w:val="bullet"/>
+      <w:lvlText w:val=""/>
+      <w:lvlJc w:val="left"/>
+      <w:pPr>
+        <w:ind w:left="0" w:firstLine="720"/>
+      </w:pPr>
+      <w:rPr>
+        <w:rFonts w:ascii="Symbol" w:hAnsi="Symbol" w:hint="default"/>
+      </w:rPr>
+    </w:lvl>
+    <w:lvl w:ilvl="1">
+      <w:start w:val="1"/>
+      <w:numFmt w:val="bullet"/>
+      <w:lvlText w:val="o"/>
+      <w:lvlJc w:val="left"/>
+      <w:pPr>
+        <w:ind w:left="1440" w:hanging="360"/>
+      </w:pPr>
+      <w:rPr>
+        <w:rFonts w:ascii="Courier New" w:hAnsi="Courier New" w:cs="Courier New" w:hint="default"/>
+      </w:rPr>
+    </w:lvl>
+    <w:lvl w:ilvl="2">
+      <w:start w:val="1"/>
+      <w:numFmt w:val="bullet"/>
+      <w:lvlText w:val=""/>
+      <w:lvlJc w:val="left"/>
+      <w:pPr>
+        <w:ind w:left="2160" w:hanging="360"/>
+      </w:pPr>
+      <w:rPr>
+        <w:rFonts w:ascii="Wingdings" w:hAnsi="Wingdings" w:hint="default"/>
+      </w:rPr>
+    </w:lvl>
+    <w:lvl w:ilvl="3">
+      <w:start w:val="1"/>
+      <w:numFmt w:val="bullet"/>
+      <w:lvlText w:val=""/>
+      <w:lvlJc w:val="left"/>
+      <w:pPr>
+        <w:ind w:left="2880" w:hanging="360"/>
+      </w:pPr>
+      <w:rPr>
+        <w:rFonts w:ascii="Symbol" w:hAnsi="Symbol" w:hint="default"/>
+      </w:rPr>
+    </w:lvl>
+    <w:lvl w:ilvl="4">
+      <w:start w:val="1"/>
+      <w:numFmt w:val="bullet"/>
+      <w:lvlText w:val="o"/>
+      <w:lvlJc w:val="left"/>
+      <w:pPr>
+        <w:ind w:left="3600" w:hanging="360"/>
+      </w:pPr>
+      <w:rPr>
+        <w:rFonts w:ascii="Courier New" w:hAnsi="Courier New" w:cs="Courier New" w:hint="default"/>
+      </w:rPr>
+    </w:lvl>
+    <w:lvl w:ilvl="5">
+      <w:start w:val="1"/>
+      <w:numFmt w:val="bullet"/>
+      <w:lvlText w:val=""/>
+      <w:lvlJc w:val="left"/>
+      <w:pPr>
+        <w:ind w:left="4320" w:hanging="360"/>
+      </w:pPr>
+      <w:rPr>
+        <w:rFonts w:ascii="Wingdings" w:hAnsi="Wingdings" w:hint="default"/>
+      </w:rPr>
+    </w:lvl>
+    <w:lvl w:ilvl="6">
+      <w:start w:val="1"/>
+      <w:numFmt w:val="bullet"/>
+      <w:lvlText w:val=""/>
+      <w:lvlJc w:val="left"/>
+      <w:pPr>
+        <w:ind w:left="5040" w:hanging="360"/>
+      </w:pPr>
+      <w:rPr>
+        <w:rFonts w:ascii="Symbol" w:hAnsi="Symbol" w:hint="default"/>
+      </w:rPr>
+    </w:lvl>
+    <w:lvl w:ilvl="7">
+      <w:start w:val="1"/>
+      <w:numFmt w:val="bullet"/>
+      <w:lvlText w:val="o"/>
+      <w:lvlJc w:val="left"/>
+      <w:pPr>
+        <w:ind w:left="5760" w:hanging="360"/>
+      </w:pPr>
+      <w:rPr>
+        <w:rFonts w:ascii="Courier New" w:hAnsi="Courier New" w:cs="Courier New" w:hint="default"/>
+      </w:rPr>
+    </w:lvl>
+    <w:lvl w:ilvl="8">
+      <w:start w:val="1"/>
+      <w:numFmt w:val="bullet"/>
+      <w:lvlText w:val=""/>
+      <w:lvlJc w:val="left"/>
+      <w:pPr>
+        <w:ind w:left="6480" w:hanging="360"/>
+      </w:pPr>
+      <w:rPr>
+        <w:rFonts w:ascii="Wingdings" w:hAnsi="Wingdings" w:hint="default"/>
+      </w:rPr>
+    </w:lvl>
+  </w:abstractNum>
+  <w:abstractNum w:abstractNumId="3" w15:restartNumberingAfterBreak="0">
+    <w:nsid w:val="165E3A08"/>
+    <w:multiLevelType w:val="hybridMultilevel"/>
+    <w:tmpl w:val="FE3E287E"/>
+    <w:lvl w:ilvl="0" w:tplc="C0B44396">
+      <w:start w:val="1"/>
+      <w:numFmt w:val="bullet"/>
+      <w:lvlText w:val=""/>
+      <w:lvlJc w:val="left"/>
+      <w:pPr>
+        <w:ind w:left="432" w:firstLine="360"/>
+      </w:pPr>
+      <w:rPr>
+        <w:rFonts w:ascii="Symbol" w:hAnsi="Symbol" w:hint="default"/>
+      </w:rPr>
+    </w:lvl>
+    <w:lvl w:ilvl="1" w:tplc="04090003" w:tentative="1">
+      <w:start w:val="1"/>
+      <w:numFmt w:val="bullet"/>
+      <w:lvlText w:val="o"/>
+      <w:lvlJc w:val="left"/>
+      <w:pPr>
+        <w:ind w:left="1440" w:hanging="360"/>
+      </w:pPr>
+      <w:rPr>
+        <w:rFonts w:ascii="Courier New" w:hAnsi="Courier New" w:cs="Courier New" w:hint="default"/>
+      </w:rPr>
+    </w:lvl>
+    <w:lvl w:ilvl="2" w:tplc="04090005" w:tentative="1">
+      <w:start w:val="1"/>
+      <w:numFmt w:val="bullet"/>
+      <w:lvlText w:val=""/>
+      <w:lvlJc w:val="left"/>
+      <w:pPr>
+        <w:ind w:left="2160" w:hanging="360"/>
+      </w:pPr>
+      <w:rPr>
+        <w:rFonts w:ascii="Wingdings" w:hAnsi="Wingdings" w:hint="default"/>
+      </w:rPr>
+    </w:lvl>
+    <w:lvl w:ilvl="3" w:tplc="04090001" w:tentative="1">
+      <w:start w:val="1"/>
+      <w:numFmt w:val="bullet"/>
+      <w:lvlText w:val=""/>
+      <w:lvlJc w:val="left"/>
+      <w:pPr>
+        <w:ind w:left="2880" w:hanging="360"/>
+      </w:pPr>
+      <w:rPr>
+        <w:rFonts w:ascii="Symbol" w:hAnsi="Symbol" w:hint="default"/>
+      </w:rPr>
+    </w:lvl>
+    <w:lvl w:ilvl="4" w:tplc="04090003" w:tentative="1">
+      <w:start w:val="1"/>
+      <w:numFmt w:val="bullet"/>
+      <w:lvlText w:val="o"/>
+      <w:lvlJc w:val="left"/>
+      <w:pPr>
+        <w:ind w:left="3600" w:hanging="360"/>
+      </w:pPr>
+      <w:rPr>
+        <w:rFonts w:ascii="Courier New" w:hAnsi="Courier New" w:cs="Courier New" w:hint="default"/>
+      </w:rPr>
+    </w:lvl>
+    <w:lvl w:ilvl="5" w:tplc="04090005" w:tentative="1">
+      <w:start w:val="1"/>
+      <w:numFmt w:val="bullet"/>
+      <w:lvlText w:val=""/>
+      <w:lvlJc w:val="left"/>
+      <w:pPr>
+        <w:ind w:left="4320" w:hanging="360"/>
+      </w:pPr>
+      <w:rPr>
+        <w:rFonts w:ascii="Wingdings" w:hAnsi="Wingdings" w:hint="default"/>
+      </w:rPr>
+    </w:lvl>
+    <w:lvl w:ilvl="6" w:tplc="04090001" w:tentative="1">
+      <w:start w:val="1"/>
+      <w:numFmt w:val="bullet"/>
+      <w:lvlText w:val=""/>
+      <w:lvlJc w:val="left"/>
+      <w:pPr>
+        <w:ind w:left="5040" w:hanging="360"/>
+      </w:pPr>
+      <w:rPr>
+        <w:rFonts w:ascii="Symbol" w:hAnsi="Symbol" w:hint="default"/>
+      </w:rPr>
+    </w:lvl>
+    <w:lvl w:ilvl="7" w:tplc="04090003" w:tentative="1">
+      <w:start w:val="1"/>
+      <w:numFmt w:val="bullet"/>
+      <w:lvlText w:val="o"/>
+      <w:lvlJc w:val="left"/>
+      <w:pPr>
+        <w:ind w:left="5760" w:hanging="360"/>
+      </w:pPr>
+      <w:rPr>
+        <w:rFonts w:ascii="Courier New" w:hAnsi="Courier New" w:cs="Courier New" w:hint="default"/>
+      </w:rPr>
+    </w:lvl>
+    <w:lvl w:ilvl="8" w:tplc="04090005" w:tentative="1">
+      <w:start w:val="1"/>
+      <w:numFmt w:val="bullet"/>
+      <w:lvlText w:val=""/>
+      <w:lvlJc w:val="left"/>
+      <w:pPr>
+        <w:ind w:left="6480" w:hanging="360"/>
+      </w:pPr>
+      <w:rPr>
+        <w:rFonts w:ascii="Wingdings" w:hAnsi="Wingdings" w:hint="default"/>
+      </w:rPr>
+    </w:lvl>
+  </w:abstractNum>
+  <w:abstractNum w:abstractNumId="4" w15:restartNumberingAfterBreak="0">
     <w:nsid w:val="170CD2DE"/>
     <w:multiLevelType w:val="multilevel"/>
     <w:tmpl w:val="2E5CE640"/>
@@ -714,8 +1218,1402 @@
       </w:pPr>
     </w:lvl>
   </w:abstractNum>
+  <w:abstractNum w:abstractNumId="5" w15:restartNumberingAfterBreak="0">
+    <w:nsid w:val="1D6C7818"/>
+    <w:multiLevelType w:val="hybridMultilevel"/>
+    <w:tmpl w:val="C7685F2A"/>
+    <w:lvl w:ilvl="0" w:tplc="F3467854">
+      <w:start w:val="1"/>
+      <w:numFmt w:val="bullet"/>
+      <w:lvlText w:val=""/>
+      <w:lvlJc w:val="left"/>
+      <w:pPr>
+        <w:ind w:left="0" w:firstLine="288"/>
+      </w:pPr>
+      <w:rPr>
+        <w:rFonts w:ascii="Symbol" w:hAnsi="Symbol" w:hint="default"/>
+      </w:rPr>
+    </w:lvl>
+    <w:lvl w:ilvl="1" w:tplc="FFFFFFFF">
+      <w:start w:val="1"/>
+      <w:numFmt w:val="lowerLetter"/>
+      <w:lvlText w:val="%2."/>
+      <w:lvlJc w:val="left"/>
+      <w:pPr>
+        <w:ind w:left="1440" w:hanging="360"/>
+      </w:pPr>
+    </w:lvl>
+    <w:lvl w:ilvl="2" w:tplc="FFFFFFFF" w:tentative="1">
+      <w:start w:val="1"/>
+      <w:numFmt w:val="lowerRoman"/>
+      <w:lvlText w:val="%3."/>
+      <w:lvlJc w:val="right"/>
+      <w:pPr>
+        <w:ind w:left="2160" w:hanging="180"/>
+      </w:pPr>
+    </w:lvl>
+    <w:lvl w:ilvl="3" w:tplc="FFFFFFFF" w:tentative="1">
+      <w:start w:val="1"/>
+      <w:numFmt w:val="decimal"/>
+      <w:lvlText w:val="%4."/>
+      <w:lvlJc w:val="left"/>
+      <w:pPr>
+        <w:ind w:left="2880" w:hanging="360"/>
+      </w:pPr>
+    </w:lvl>
+    <w:lvl w:ilvl="4" w:tplc="FFFFFFFF" w:tentative="1">
+      <w:start w:val="1"/>
+      <w:numFmt w:val="lowerLetter"/>
+      <w:lvlText w:val="%5."/>
+      <w:lvlJc w:val="left"/>
+      <w:pPr>
+        <w:ind w:left="3600" w:hanging="360"/>
+      </w:pPr>
+    </w:lvl>
+    <w:lvl w:ilvl="5" w:tplc="FFFFFFFF" w:tentative="1">
+      <w:start w:val="1"/>
+      <w:numFmt w:val="lowerRoman"/>
+      <w:lvlText w:val="%6."/>
+      <w:lvlJc w:val="right"/>
+      <w:pPr>
+        <w:ind w:left="4320" w:hanging="180"/>
+      </w:pPr>
+    </w:lvl>
+    <w:lvl w:ilvl="6" w:tplc="FFFFFFFF" w:tentative="1">
+      <w:start w:val="1"/>
+      <w:numFmt w:val="decimal"/>
+      <w:lvlText w:val="%7."/>
+      <w:lvlJc w:val="left"/>
+      <w:pPr>
+        <w:ind w:left="5040" w:hanging="360"/>
+      </w:pPr>
+    </w:lvl>
+    <w:lvl w:ilvl="7" w:tplc="FFFFFFFF" w:tentative="1">
+      <w:start w:val="1"/>
+      <w:numFmt w:val="lowerLetter"/>
+      <w:lvlText w:val="%8."/>
+      <w:lvlJc w:val="left"/>
+      <w:pPr>
+        <w:ind w:left="5760" w:hanging="360"/>
+      </w:pPr>
+    </w:lvl>
+    <w:lvl w:ilvl="8" w:tplc="FFFFFFFF" w:tentative="1">
+      <w:start w:val="1"/>
+      <w:numFmt w:val="lowerRoman"/>
+      <w:lvlText w:val="%9."/>
+      <w:lvlJc w:val="right"/>
+      <w:pPr>
+        <w:ind w:left="6480" w:hanging="180"/>
+      </w:pPr>
+    </w:lvl>
+  </w:abstractNum>
+  <w:abstractNum w:abstractNumId="6" w15:restartNumberingAfterBreak="0">
+    <w:nsid w:val="21805A49"/>
+    <w:multiLevelType w:val="hybridMultilevel"/>
+    <w:tmpl w:val="BB10C9EE"/>
+    <w:lvl w:ilvl="0" w:tplc="F3467854">
+      <w:start w:val="1"/>
+      <w:numFmt w:val="bullet"/>
+      <w:lvlText w:val=""/>
+      <w:lvlJc w:val="left"/>
+      <w:pPr>
+        <w:ind w:left="720" w:hanging="360"/>
+      </w:pPr>
+      <w:rPr>
+        <w:rFonts w:ascii="Symbol" w:hAnsi="Symbol" w:hint="default"/>
+      </w:rPr>
+    </w:lvl>
+    <w:lvl w:ilvl="1" w:tplc="04090003">
+      <w:start w:val="1"/>
+      <w:numFmt w:val="bullet"/>
+      <w:lvlText w:val="o"/>
+      <w:lvlJc w:val="left"/>
+      <w:pPr>
+        <w:ind w:left="1440" w:hanging="360"/>
+      </w:pPr>
+      <w:rPr>
+        <w:rFonts w:ascii="Courier New" w:hAnsi="Courier New" w:cs="Courier New" w:hint="default"/>
+      </w:rPr>
+    </w:lvl>
+    <w:lvl w:ilvl="2" w:tplc="04090005">
+      <w:start w:val="1"/>
+      <w:numFmt w:val="bullet"/>
+      <w:lvlText w:val=""/>
+      <w:lvlJc w:val="left"/>
+      <w:pPr>
+        <w:ind w:left="2160" w:hanging="360"/>
+      </w:pPr>
+      <w:rPr>
+        <w:rFonts w:ascii="Wingdings" w:hAnsi="Wingdings" w:hint="default"/>
+      </w:rPr>
+    </w:lvl>
+    <w:lvl w:ilvl="3" w:tplc="04090001" w:tentative="1">
+      <w:start w:val="1"/>
+      <w:numFmt w:val="bullet"/>
+      <w:lvlText w:val=""/>
+      <w:lvlJc w:val="left"/>
+      <w:pPr>
+        <w:ind w:left="2880" w:hanging="360"/>
+      </w:pPr>
+      <w:rPr>
+        <w:rFonts w:ascii="Symbol" w:hAnsi="Symbol" w:hint="default"/>
+      </w:rPr>
+    </w:lvl>
+    <w:lvl w:ilvl="4" w:tplc="04090003" w:tentative="1">
+      <w:start w:val="1"/>
+      <w:numFmt w:val="bullet"/>
+      <w:lvlText w:val="o"/>
+      <w:lvlJc w:val="left"/>
+      <w:pPr>
+        <w:ind w:left="3600" w:hanging="360"/>
+      </w:pPr>
+      <w:rPr>
+        <w:rFonts w:ascii="Courier New" w:hAnsi="Courier New" w:cs="Courier New" w:hint="default"/>
+      </w:rPr>
+    </w:lvl>
+    <w:lvl w:ilvl="5" w:tplc="04090005" w:tentative="1">
+      <w:start w:val="1"/>
+      <w:numFmt w:val="bullet"/>
+      <w:lvlText w:val=""/>
+      <w:lvlJc w:val="left"/>
+      <w:pPr>
+        <w:ind w:left="4320" w:hanging="360"/>
+      </w:pPr>
+      <w:rPr>
+        <w:rFonts w:ascii="Wingdings" w:hAnsi="Wingdings" w:hint="default"/>
+      </w:rPr>
+    </w:lvl>
+    <w:lvl w:ilvl="6" w:tplc="04090001" w:tentative="1">
+      <w:start w:val="1"/>
+      <w:numFmt w:val="bullet"/>
+      <w:lvlText w:val=""/>
+      <w:lvlJc w:val="left"/>
+      <w:pPr>
+        <w:ind w:left="5040" w:hanging="360"/>
+      </w:pPr>
+      <w:rPr>
+        <w:rFonts w:ascii="Symbol" w:hAnsi="Symbol" w:hint="default"/>
+      </w:rPr>
+    </w:lvl>
+    <w:lvl w:ilvl="7" w:tplc="04090003" w:tentative="1">
+      <w:start w:val="1"/>
+      <w:numFmt w:val="bullet"/>
+      <w:lvlText w:val="o"/>
+      <w:lvlJc w:val="left"/>
+      <w:pPr>
+        <w:ind w:left="5760" w:hanging="360"/>
+      </w:pPr>
+      <w:rPr>
+        <w:rFonts w:ascii="Courier New" w:hAnsi="Courier New" w:cs="Courier New" w:hint="default"/>
+      </w:rPr>
+    </w:lvl>
+    <w:lvl w:ilvl="8" w:tplc="04090005" w:tentative="1">
+      <w:start w:val="1"/>
+      <w:numFmt w:val="bullet"/>
+      <w:lvlText w:val=""/>
+      <w:lvlJc w:val="left"/>
+      <w:pPr>
+        <w:ind w:left="6480" w:hanging="360"/>
+      </w:pPr>
+      <w:rPr>
+        <w:rFonts w:ascii="Wingdings" w:hAnsi="Wingdings" w:hint="default"/>
+      </w:rPr>
+    </w:lvl>
+  </w:abstractNum>
+  <w:abstractNum w:abstractNumId="7" w15:restartNumberingAfterBreak="0">
+    <w:nsid w:val="2FF0522D"/>
+    <w:multiLevelType w:val="multilevel"/>
+    <w:tmpl w:val="0409001D"/>
+    <w:lvl w:ilvl="0">
+      <w:start w:val="1"/>
+      <w:numFmt w:val="decimal"/>
+      <w:lvlText w:val="%1)"/>
+      <w:lvlJc w:val="left"/>
+      <w:pPr>
+        <w:ind w:left="360" w:hanging="360"/>
+      </w:pPr>
+    </w:lvl>
+    <w:lvl w:ilvl="1">
+      <w:start w:val="1"/>
+      <w:numFmt w:val="lowerLetter"/>
+      <w:lvlText w:val="%2)"/>
+      <w:lvlJc w:val="left"/>
+      <w:pPr>
+        <w:ind w:left="720" w:hanging="360"/>
+      </w:pPr>
+    </w:lvl>
+    <w:lvl w:ilvl="2">
+      <w:start w:val="1"/>
+      <w:numFmt w:val="lowerRoman"/>
+      <w:lvlText w:val="%3)"/>
+      <w:lvlJc w:val="left"/>
+      <w:pPr>
+        <w:ind w:left="1080" w:hanging="360"/>
+      </w:pPr>
+    </w:lvl>
+    <w:lvl w:ilvl="3">
+      <w:start w:val="1"/>
+      <w:numFmt w:val="decimal"/>
+      <w:lvlText w:val="(%4)"/>
+      <w:lvlJc w:val="left"/>
+      <w:pPr>
+        <w:ind w:left="1440" w:hanging="360"/>
+      </w:pPr>
+    </w:lvl>
+    <w:lvl w:ilvl="4">
+      <w:start w:val="1"/>
+      <w:numFmt w:val="lowerLetter"/>
+      <w:lvlText w:val="(%5)"/>
+      <w:lvlJc w:val="left"/>
+      <w:pPr>
+        <w:ind w:left="1800" w:hanging="360"/>
+      </w:pPr>
+    </w:lvl>
+    <w:lvl w:ilvl="5">
+      <w:start w:val="1"/>
+      <w:numFmt w:val="lowerRoman"/>
+      <w:lvlText w:val="(%6)"/>
+      <w:lvlJc w:val="left"/>
+      <w:pPr>
+        <w:ind w:left="2160" w:hanging="360"/>
+      </w:pPr>
+    </w:lvl>
+    <w:lvl w:ilvl="6">
+      <w:start w:val="1"/>
+      <w:numFmt w:val="decimal"/>
+      <w:lvlText w:val="%7."/>
+      <w:lvlJc w:val="left"/>
+      <w:pPr>
+        <w:ind w:left="2520" w:hanging="360"/>
+      </w:pPr>
+    </w:lvl>
+    <w:lvl w:ilvl="7">
+      <w:start w:val="1"/>
+      <w:numFmt w:val="lowerLetter"/>
+      <w:lvlText w:val="%8."/>
+      <w:lvlJc w:val="left"/>
+      <w:pPr>
+        <w:ind w:left="2880" w:hanging="360"/>
+      </w:pPr>
+    </w:lvl>
+    <w:lvl w:ilvl="8">
+      <w:start w:val="1"/>
+      <w:numFmt w:val="lowerRoman"/>
+      <w:lvlText w:val="%9."/>
+      <w:lvlJc w:val="left"/>
+      <w:pPr>
+        <w:ind w:left="3240" w:hanging="360"/>
+      </w:pPr>
+    </w:lvl>
+  </w:abstractNum>
+  <w:abstractNum w:abstractNumId="8" w15:restartNumberingAfterBreak="0">
+    <w:nsid w:val="36465E9A"/>
+    <w:multiLevelType w:val="hybridMultilevel"/>
+    <w:tmpl w:val="EF901826"/>
+    <w:lvl w:ilvl="0" w:tplc="F3467854">
+      <w:start w:val="1"/>
+      <w:numFmt w:val="bullet"/>
+      <w:lvlText w:val=""/>
+      <w:lvlJc w:val="left"/>
+      <w:pPr>
+        <w:ind w:left="720" w:hanging="360"/>
+      </w:pPr>
+      <w:rPr>
+        <w:rFonts w:ascii="Symbol" w:hAnsi="Symbol" w:hint="default"/>
+      </w:rPr>
+    </w:lvl>
+    <w:lvl w:ilvl="1" w:tplc="04090003">
+      <w:start w:val="1"/>
+      <w:numFmt w:val="bullet"/>
+      <w:lvlText w:val="o"/>
+      <w:lvlJc w:val="left"/>
+      <w:pPr>
+        <w:ind w:left="1440" w:hanging="360"/>
+      </w:pPr>
+      <w:rPr>
+        <w:rFonts w:ascii="Courier New" w:hAnsi="Courier New" w:cs="Courier New" w:hint="default"/>
+      </w:rPr>
+    </w:lvl>
+    <w:lvl w:ilvl="2" w:tplc="04090005" w:tentative="1">
+      <w:start w:val="1"/>
+      <w:numFmt w:val="bullet"/>
+      <w:lvlText w:val=""/>
+      <w:lvlJc w:val="left"/>
+      <w:pPr>
+        <w:ind w:left="2160" w:hanging="360"/>
+      </w:pPr>
+      <w:rPr>
+        <w:rFonts w:ascii="Wingdings" w:hAnsi="Wingdings" w:hint="default"/>
+      </w:rPr>
+    </w:lvl>
+    <w:lvl w:ilvl="3" w:tplc="04090001" w:tentative="1">
+      <w:start w:val="1"/>
+      <w:numFmt w:val="bullet"/>
+      <w:lvlText w:val=""/>
+      <w:lvlJc w:val="left"/>
+      <w:pPr>
+        <w:ind w:left="2880" w:hanging="360"/>
+      </w:pPr>
+      <w:rPr>
+        <w:rFonts w:ascii="Symbol" w:hAnsi="Symbol" w:hint="default"/>
+      </w:rPr>
+    </w:lvl>
+    <w:lvl w:ilvl="4" w:tplc="04090003" w:tentative="1">
+      <w:start w:val="1"/>
+      <w:numFmt w:val="bullet"/>
+      <w:lvlText w:val="o"/>
+      <w:lvlJc w:val="left"/>
+      <w:pPr>
+        <w:ind w:left="3600" w:hanging="360"/>
+      </w:pPr>
+      <w:rPr>
+        <w:rFonts w:ascii="Courier New" w:hAnsi="Courier New" w:cs="Courier New" w:hint="default"/>
+      </w:rPr>
+    </w:lvl>
+    <w:lvl w:ilvl="5" w:tplc="04090005" w:tentative="1">
+      <w:start w:val="1"/>
+      <w:numFmt w:val="bullet"/>
+      <w:lvlText w:val=""/>
+      <w:lvlJc w:val="left"/>
+      <w:pPr>
+        <w:ind w:left="4320" w:hanging="360"/>
+      </w:pPr>
+      <w:rPr>
+        <w:rFonts w:ascii="Wingdings" w:hAnsi="Wingdings" w:hint="default"/>
+      </w:rPr>
+    </w:lvl>
+    <w:lvl w:ilvl="6" w:tplc="04090001" w:tentative="1">
+      <w:start w:val="1"/>
+      <w:numFmt w:val="bullet"/>
+      <w:lvlText w:val=""/>
+      <w:lvlJc w:val="left"/>
+      <w:pPr>
+        <w:ind w:left="5040" w:hanging="360"/>
+      </w:pPr>
+      <w:rPr>
+        <w:rFonts w:ascii="Symbol" w:hAnsi="Symbol" w:hint="default"/>
+      </w:rPr>
+    </w:lvl>
+    <w:lvl w:ilvl="7" w:tplc="04090003" w:tentative="1">
+      <w:start w:val="1"/>
+      <w:numFmt w:val="bullet"/>
+      <w:lvlText w:val="o"/>
+      <w:lvlJc w:val="left"/>
+      <w:pPr>
+        <w:ind w:left="5760" w:hanging="360"/>
+      </w:pPr>
+      <w:rPr>
+        <w:rFonts w:ascii="Courier New" w:hAnsi="Courier New" w:cs="Courier New" w:hint="default"/>
+      </w:rPr>
+    </w:lvl>
+    <w:lvl w:ilvl="8" w:tplc="04090005" w:tentative="1">
+      <w:start w:val="1"/>
+      <w:numFmt w:val="bullet"/>
+      <w:lvlText w:val=""/>
+      <w:lvlJc w:val="left"/>
+      <w:pPr>
+        <w:ind w:left="6480" w:hanging="360"/>
+      </w:pPr>
+      <w:rPr>
+        <w:rFonts w:ascii="Wingdings" w:hAnsi="Wingdings" w:hint="default"/>
+      </w:rPr>
+    </w:lvl>
+  </w:abstractNum>
+  <w:abstractNum w:abstractNumId="9" w15:restartNumberingAfterBreak="0">
+    <w:nsid w:val="381675C9"/>
+    <w:multiLevelType w:val="hybridMultilevel"/>
+    <w:tmpl w:val="D8B40B02"/>
+    <w:lvl w:ilvl="0" w:tplc="30EE9D04">
+      <w:start w:val="1"/>
+      <w:numFmt w:val="bullet"/>
+      <w:lvlText w:val=""/>
+      <w:lvlJc w:val="left"/>
+      <w:pPr>
+        <w:ind w:left="1080" w:hanging="360"/>
+      </w:pPr>
+      <w:rPr>
+        <w:rFonts w:ascii="Symbol" w:hAnsi="Symbol" w:hint="default"/>
+      </w:rPr>
+    </w:lvl>
+    <w:lvl w:ilvl="1" w:tplc="04090003" w:tentative="1">
+      <w:start w:val="1"/>
+      <w:numFmt w:val="bullet"/>
+      <w:lvlText w:val="o"/>
+      <w:lvlJc w:val="left"/>
+      <w:pPr>
+        <w:ind w:left="1800" w:hanging="360"/>
+      </w:pPr>
+      <w:rPr>
+        <w:rFonts w:ascii="Courier New" w:hAnsi="Courier New" w:cs="Courier New" w:hint="default"/>
+      </w:rPr>
+    </w:lvl>
+    <w:lvl w:ilvl="2" w:tplc="04090005" w:tentative="1">
+      <w:start w:val="1"/>
+      <w:numFmt w:val="bullet"/>
+      <w:lvlText w:val=""/>
+      <w:lvlJc w:val="left"/>
+      <w:pPr>
+        <w:ind w:left="2520" w:hanging="360"/>
+      </w:pPr>
+      <w:rPr>
+        <w:rFonts w:ascii="Wingdings" w:hAnsi="Wingdings" w:hint="default"/>
+      </w:rPr>
+    </w:lvl>
+    <w:lvl w:ilvl="3" w:tplc="04090001" w:tentative="1">
+      <w:start w:val="1"/>
+      <w:numFmt w:val="bullet"/>
+      <w:lvlText w:val=""/>
+      <w:lvlJc w:val="left"/>
+      <w:pPr>
+        <w:ind w:left="3240" w:hanging="360"/>
+      </w:pPr>
+      <w:rPr>
+        <w:rFonts w:ascii="Symbol" w:hAnsi="Symbol" w:hint="default"/>
+      </w:rPr>
+    </w:lvl>
+    <w:lvl w:ilvl="4" w:tplc="04090003" w:tentative="1">
+      <w:start w:val="1"/>
+      <w:numFmt w:val="bullet"/>
+      <w:lvlText w:val="o"/>
+      <w:lvlJc w:val="left"/>
+      <w:pPr>
+        <w:ind w:left="3960" w:hanging="360"/>
+      </w:pPr>
+      <w:rPr>
+        <w:rFonts w:ascii="Courier New" w:hAnsi="Courier New" w:cs="Courier New" w:hint="default"/>
+      </w:rPr>
+    </w:lvl>
+    <w:lvl w:ilvl="5" w:tplc="04090005" w:tentative="1">
+      <w:start w:val="1"/>
+      <w:numFmt w:val="bullet"/>
+      <w:lvlText w:val=""/>
+      <w:lvlJc w:val="left"/>
+      <w:pPr>
+        <w:ind w:left="4680" w:hanging="360"/>
+      </w:pPr>
+      <w:rPr>
+        <w:rFonts w:ascii="Wingdings" w:hAnsi="Wingdings" w:hint="default"/>
+      </w:rPr>
+    </w:lvl>
+    <w:lvl w:ilvl="6" w:tplc="04090001" w:tentative="1">
+      <w:start w:val="1"/>
+      <w:numFmt w:val="bullet"/>
+      <w:lvlText w:val=""/>
+      <w:lvlJc w:val="left"/>
+      <w:pPr>
+        <w:ind w:left="5400" w:hanging="360"/>
+      </w:pPr>
+      <w:rPr>
+        <w:rFonts w:ascii="Symbol" w:hAnsi="Symbol" w:hint="default"/>
+      </w:rPr>
+    </w:lvl>
+    <w:lvl w:ilvl="7" w:tplc="04090003" w:tentative="1">
+      <w:start w:val="1"/>
+      <w:numFmt w:val="bullet"/>
+      <w:lvlText w:val="o"/>
+      <w:lvlJc w:val="left"/>
+      <w:pPr>
+        <w:ind w:left="6120" w:hanging="360"/>
+      </w:pPr>
+      <w:rPr>
+        <w:rFonts w:ascii="Courier New" w:hAnsi="Courier New" w:cs="Courier New" w:hint="default"/>
+      </w:rPr>
+    </w:lvl>
+    <w:lvl w:ilvl="8" w:tplc="04090005" w:tentative="1">
+      <w:start w:val="1"/>
+      <w:numFmt w:val="bullet"/>
+      <w:lvlText w:val=""/>
+      <w:lvlJc w:val="left"/>
+      <w:pPr>
+        <w:ind w:left="6840" w:hanging="360"/>
+      </w:pPr>
+      <w:rPr>
+        <w:rFonts w:ascii="Wingdings" w:hAnsi="Wingdings" w:hint="default"/>
+      </w:rPr>
+    </w:lvl>
+  </w:abstractNum>
+  <w:abstractNum w:abstractNumId="10" w15:restartNumberingAfterBreak="0">
+    <w:nsid w:val="3A286067"/>
+    <w:multiLevelType w:val="hybridMultilevel"/>
+    <w:tmpl w:val="1B26FA00"/>
+    <w:lvl w:ilvl="0" w:tplc="F3467854">
+      <w:start w:val="1"/>
+      <w:numFmt w:val="bullet"/>
+      <w:lvlText w:val=""/>
+      <w:lvlJc w:val="left"/>
+      <w:pPr>
+        <w:ind w:left="0" w:firstLine="288"/>
+      </w:pPr>
+      <w:rPr>
+        <w:rFonts w:ascii="Symbol" w:hAnsi="Symbol" w:hint="default"/>
+      </w:rPr>
+    </w:lvl>
+    <w:lvl w:ilvl="1" w:tplc="04090003">
+      <w:start w:val="1"/>
+      <w:numFmt w:val="bullet"/>
+      <w:lvlText w:val="o"/>
+      <w:lvlJc w:val="left"/>
+      <w:pPr>
+        <w:ind w:left="1440" w:hanging="360"/>
+      </w:pPr>
+      <w:rPr>
+        <w:rFonts w:ascii="Courier New" w:hAnsi="Courier New" w:cs="Courier New" w:hint="default"/>
+      </w:rPr>
+    </w:lvl>
+    <w:lvl w:ilvl="2" w:tplc="04090005" w:tentative="1">
+      <w:start w:val="1"/>
+      <w:numFmt w:val="bullet"/>
+      <w:lvlText w:val=""/>
+      <w:lvlJc w:val="left"/>
+      <w:pPr>
+        <w:ind w:left="2160" w:hanging="360"/>
+      </w:pPr>
+      <w:rPr>
+        <w:rFonts w:ascii="Wingdings" w:hAnsi="Wingdings" w:hint="default"/>
+      </w:rPr>
+    </w:lvl>
+    <w:lvl w:ilvl="3" w:tplc="04090001" w:tentative="1">
+      <w:start w:val="1"/>
+      <w:numFmt w:val="bullet"/>
+      <w:lvlText w:val=""/>
+      <w:lvlJc w:val="left"/>
+      <w:pPr>
+        <w:ind w:left="2880" w:hanging="360"/>
+      </w:pPr>
+      <w:rPr>
+        <w:rFonts w:ascii="Symbol" w:hAnsi="Symbol" w:hint="default"/>
+      </w:rPr>
+    </w:lvl>
+    <w:lvl w:ilvl="4" w:tplc="04090003" w:tentative="1">
+      <w:start w:val="1"/>
+      <w:numFmt w:val="bullet"/>
+      <w:lvlText w:val="o"/>
+      <w:lvlJc w:val="left"/>
+      <w:pPr>
+        <w:ind w:left="3600" w:hanging="360"/>
+      </w:pPr>
+      <w:rPr>
+        <w:rFonts w:ascii="Courier New" w:hAnsi="Courier New" w:cs="Courier New" w:hint="default"/>
+      </w:rPr>
+    </w:lvl>
+    <w:lvl w:ilvl="5" w:tplc="04090005" w:tentative="1">
+      <w:start w:val="1"/>
+      <w:numFmt w:val="bullet"/>
+      <w:lvlText w:val=""/>
+      <w:lvlJc w:val="left"/>
+      <w:pPr>
+        <w:ind w:left="4320" w:hanging="360"/>
+      </w:pPr>
+      <w:rPr>
+        <w:rFonts w:ascii="Wingdings" w:hAnsi="Wingdings" w:hint="default"/>
+      </w:rPr>
+    </w:lvl>
+    <w:lvl w:ilvl="6" w:tplc="04090001" w:tentative="1">
+      <w:start w:val="1"/>
+      <w:numFmt w:val="bullet"/>
+      <w:lvlText w:val=""/>
+      <w:lvlJc w:val="left"/>
+      <w:pPr>
+        <w:ind w:left="5040" w:hanging="360"/>
+      </w:pPr>
+      <w:rPr>
+        <w:rFonts w:ascii="Symbol" w:hAnsi="Symbol" w:hint="default"/>
+      </w:rPr>
+    </w:lvl>
+    <w:lvl w:ilvl="7" w:tplc="04090003" w:tentative="1">
+      <w:start w:val="1"/>
+      <w:numFmt w:val="bullet"/>
+      <w:lvlText w:val="o"/>
+      <w:lvlJc w:val="left"/>
+      <w:pPr>
+        <w:ind w:left="5760" w:hanging="360"/>
+      </w:pPr>
+      <w:rPr>
+        <w:rFonts w:ascii="Courier New" w:hAnsi="Courier New" w:cs="Courier New" w:hint="default"/>
+      </w:rPr>
+    </w:lvl>
+    <w:lvl w:ilvl="8" w:tplc="04090005" w:tentative="1">
+      <w:start w:val="1"/>
+      <w:numFmt w:val="bullet"/>
+      <w:lvlText w:val=""/>
+      <w:lvlJc w:val="left"/>
+      <w:pPr>
+        <w:ind w:left="6480" w:hanging="360"/>
+      </w:pPr>
+      <w:rPr>
+        <w:rFonts w:ascii="Wingdings" w:hAnsi="Wingdings" w:hint="default"/>
+      </w:rPr>
+    </w:lvl>
+  </w:abstractNum>
+  <w:abstractNum w:abstractNumId="11" w15:restartNumberingAfterBreak="0">
+    <w:nsid w:val="3F3B7CEF"/>
+    <w:multiLevelType w:val="hybridMultilevel"/>
+    <w:tmpl w:val="72D48DA2"/>
+    <w:lvl w:ilvl="0" w:tplc="0420B65C">
+      <w:start w:val="1"/>
+      <w:numFmt w:val="bullet"/>
+      <w:lvlText w:val=""/>
+      <w:lvlJc w:val="left"/>
+      <w:pPr>
+        <w:ind w:left="720" w:hanging="360"/>
+      </w:pPr>
+      <w:rPr>
+        <w:rFonts w:ascii="Symbol" w:hAnsi="Symbol" w:hint="default"/>
+      </w:rPr>
+    </w:lvl>
+    <w:lvl w:ilvl="1" w:tplc="F3467854">
+      <w:start w:val="1"/>
+      <w:numFmt w:val="bullet"/>
+      <w:lvlText w:val=""/>
+      <w:lvlJc w:val="left"/>
+      <w:pPr>
+        <w:ind w:left="1440" w:hanging="360"/>
+      </w:pPr>
+      <w:rPr>
+        <w:rFonts w:ascii="Symbol" w:hAnsi="Symbol" w:hint="default"/>
+      </w:rPr>
+    </w:lvl>
+    <w:lvl w:ilvl="2" w:tplc="04090005">
+      <w:start w:val="1"/>
+      <w:numFmt w:val="bullet"/>
+      <w:lvlText w:val=""/>
+      <w:lvlJc w:val="left"/>
+      <w:pPr>
+        <w:ind w:left="2160" w:hanging="360"/>
+      </w:pPr>
+      <w:rPr>
+        <w:rFonts w:ascii="Wingdings" w:hAnsi="Wingdings" w:hint="default"/>
+      </w:rPr>
+    </w:lvl>
+    <w:lvl w:ilvl="3" w:tplc="04090001" w:tentative="1">
+      <w:start w:val="1"/>
+      <w:numFmt w:val="bullet"/>
+      <w:lvlText w:val=""/>
+      <w:lvlJc w:val="left"/>
+      <w:pPr>
+        <w:ind w:left="2880" w:hanging="360"/>
+      </w:pPr>
+      <w:rPr>
+        <w:rFonts w:ascii="Symbol" w:hAnsi="Symbol" w:hint="default"/>
+      </w:rPr>
+    </w:lvl>
+    <w:lvl w:ilvl="4" w:tplc="04090003" w:tentative="1">
+      <w:start w:val="1"/>
+      <w:numFmt w:val="bullet"/>
+      <w:lvlText w:val="o"/>
+      <w:lvlJc w:val="left"/>
+      <w:pPr>
+        <w:ind w:left="3600" w:hanging="360"/>
+      </w:pPr>
+      <w:rPr>
+        <w:rFonts w:ascii="Courier New" w:hAnsi="Courier New" w:cs="Courier New" w:hint="default"/>
+      </w:rPr>
+    </w:lvl>
+    <w:lvl w:ilvl="5" w:tplc="04090005" w:tentative="1">
+      <w:start w:val="1"/>
+      <w:numFmt w:val="bullet"/>
+      <w:lvlText w:val=""/>
+      <w:lvlJc w:val="left"/>
+      <w:pPr>
+        <w:ind w:left="4320" w:hanging="360"/>
+      </w:pPr>
+      <w:rPr>
+        <w:rFonts w:ascii="Wingdings" w:hAnsi="Wingdings" w:hint="default"/>
+      </w:rPr>
+    </w:lvl>
+    <w:lvl w:ilvl="6" w:tplc="04090001" w:tentative="1">
+      <w:start w:val="1"/>
+      <w:numFmt w:val="bullet"/>
+      <w:lvlText w:val=""/>
+      <w:lvlJc w:val="left"/>
+      <w:pPr>
+        <w:ind w:left="5040" w:hanging="360"/>
+      </w:pPr>
+      <w:rPr>
+        <w:rFonts w:ascii="Symbol" w:hAnsi="Symbol" w:hint="default"/>
+      </w:rPr>
+    </w:lvl>
+    <w:lvl w:ilvl="7" w:tplc="04090003" w:tentative="1">
+      <w:start w:val="1"/>
+      <w:numFmt w:val="bullet"/>
+      <w:lvlText w:val="o"/>
+      <w:lvlJc w:val="left"/>
+      <w:pPr>
+        <w:ind w:left="5760" w:hanging="360"/>
+      </w:pPr>
+      <w:rPr>
+        <w:rFonts w:ascii="Courier New" w:hAnsi="Courier New" w:cs="Courier New" w:hint="default"/>
+      </w:rPr>
+    </w:lvl>
+    <w:lvl w:ilvl="8" w:tplc="04090005" w:tentative="1">
+      <w:start w:val="1"/>
+      <w:numFmt w:val="bullet"/>
+      <w:lvlText w:val=""/>
+      <w:lvlJc w:val="left"/>
+      <w:pPr>
+        <w:ind w:left="6480" w:hanging="360"/>
+      </w:pPr>
+      <w:rPr>
+        <w:rFonts w:ascii="Wingdings" w:hAnsi="Wingdings" w:hint="default"/>
+      </w:rPr>
+    </w:lvl>
+  </w:abstractNum>
+  <w:abstractNum w:abstractNumId="12" w15:restartNumberingAfterBreak="0">
+    <w:nsid w:val="457D2251"/>
+    <w:multiLevelType w:val="hybridMultilevel"/>
+    <w:tmpl w:val="8C260FD8"/>
+    <w:lvl w:ilvl="0" w:tplc="04090001">
+      <w:start w:val="1"/>
+      <w:numFmt w:val="bullet"/>
+      <w:lvlText w:val=""/>
+      <w:lvlJc w:val="left"/>
+      <w:pPr>
+        <w:ind w:left="720" w:hanging="360"/>
+      </w:pPr>
+      <w:rPr>
+        <w:rFonts w:ascii="Symbol" w:hAnsi="Symbol" w:hint="default"/>
+      </w:rPr>
+    </w:lvl>
+    <w:lvl w:ilvl="1" w:tplc="04090003">
+      <w:start w:val="1"/>
+      <w:numFmt w:val="bullet"/>
+      <w:lvlText w:val="o"/>
+      <w:lvlJc w:val="left"/>
+      <w:pPr>
+        <w:ind w:left="1440" w:hanging="360"/>
+      </w:pPr>
+      <w:rPr>
+        <w:rFonts w:ascii="Courier New" w:hAnsi="Courier New" w:cs="Courier New" w:hint="default"/>
+      </w:rPr>
+    </w:lvl>
+    <w:lvl w:ilvl="2" w:tplc="04090005">
+      <w:start w:val="1"/>
+      <w:numFmt w:val="bullet"/>
+      <w:lvlText w:val=""/>
+      <w:lvlJc w:val="left"/>
+      <w:pPr>
+        <w:ind w:left="2160" w:hanging="360"/>
+      </w:pPr>
+      <w:rPr>
+        <w:rFonts w:ascii="Wingdings" w:hAnsi="Wingdings" w:hint="default"/>
+      </w:rPr>
+    </w:lvl>
+    <w:lvl w:ilvl="3" w:tplc="04090001" w:tentative="1">
+      <w:start w:val="1"/>
+      <w:numFmt w:val="bullet"/>
+      <w:lvlText w:val=""/>
+      <w:lvlJc w:val="left"/>
+      <w:pPr>
+        <w:ind w:left="2880" w:hanging="360"/>
+      </w:pPr>
+      <w:rPr>
+        <w:rFonts w:ascii="Symbol" w:hAnsi="Symbol" w:hint="default"/>
+      </w:rPr>
+    </w:lvl>
+    <w:lvl w:ilvl="4" w:tplc="04090003" w:tentative="1">
+      <w:start w:val="1"/>
+      <w:numFmt w:val="bullet"/>
+      <w:lvlText w:val="o"/>
+      <w:lvlJc w:val="left"/>
+      <w:pPr>
+        <w:ind w:left="3600" w:hanging="360"/>
+      </w:pPr>
+      <w:rPr>
+        <w:rFonts w:ascii="Courier New" w:hAnsi="Courier New" w:cs="Courier New" w:hint="default"/>
+      </w:rPr>
+    </w:lvl>
+    <w:lvl w:ilvl="5" w:tplc="04090005" w:tentative="1">
+      <w:start w:val="1"/>
+      <w:numFmt w:val="bullet"/>
+      <w:lvlText w:val=""/>
+      <w:lvlJc w:val="left"/>
+      <w:pPr>
+        <w:ind w:left="4320" w:hanging="360"/>
+      </w:pPr>
+      <w:rPr>
+        <w:rFonts w:ascii="Wingdings" w:hAnsi="Wingdings" w:hint="default"/>
+      </w:rPr>
+    </w:lvl>
+    <w:lvl w:ilvl="6" w:tplc="04090001" w:tentative="1">
+      <w:start w:val="1"/>
+      <w:numFmt w:val="bullet"/>
+      <w:lvlText w:val=""/>
+      <w:lvlJc w:val="left"/>
+      <w:pPr>
+        <w:ind w:left="5040" w:hanging="360"/>
+      </w:pPr>
+      <w:rPr>
+        <w:rFonts w:ascii="Symbol" w:hAnsi="Symbol" w:hint="default"/>
+      </w:rPr>
+    </w:lvl>
+    <w:lvl w:ilvl="7" w:tplc="04090003" w:tentative="1">
+      <w:start w:val="1"/>
+      <w:numFmt w:val="bullet"/>
+      <w:lvlText w:val="o"/>
+      <w:lvlJc w:val="left"/>
+      <w:pPr>
+        <w:ind w:left="5760" w:hanging="360"/>
+      </w:pPr>
+      <w:rPr>
+        <w:rFonts w:ascii="Courier New" w:hAnsi="Courier New" w:cs="Courier New" w:hint="default"/>
+      </w:rPr>
+    </w:lvl>
+    <w:lvl w:ilvl="8" w:tplc="04090005" w:tentative="1">
+      <w:start w:val="1"/>
+      <w:numFmt w:val="bullet"/>
+      <w:lvlText w:val=""/>
+      <w:lvlJc w:val="left"/>
+      <w:pPr>
+        <w:ind w:left="6480" w:hanging="360"/>
+      </w:pPr>
+      <w:rPr>
+        <w:rFonts w:ascii="Wingdings" w:hAnsi="Wingdings" w:hint="default"/>
+      </w:rPr>
+    </w:lvl>
+  </w:abstractNum>
+  <w:abstractNum w:abstractNumId="13" w15:restartNumberingAfterBreak="0">
+    <w:nsid w:val="4F7462BD"/>
+    <w:multiLevelType w:val="hybridMultilevel"/>
+    <w:tmpl w:val="EB8013F4"/>
+    <w:lvl w:ilvl="0" w:tplc="600AE5EE">
+      <w:start w:val="1"/>
+      <w:numFmt w:val="bullet"/>
+      <w:pStyle w:val="Compact"/>
+      <w:lvlText w:val=""/>
+      <w:lvlJc w:val="left"/>
+      <w:pPr>
+        <w:ind w:left="72" w:firstLine="360"/>
+      </w:pPr>
+      <w:rPr>
+        <w:rFonts w:ascii="Symbol" w:hAnsi="Symbol" w:hint="default"/>
+      </w:rPr>
+    </w:lvl>
+    <w:lvl w:ilvl="1" w:tplc="04090003" w:tentative="1">
+      <w:start w:val="1"/>
+      <w:numFmt w:val="bullet"/>
+      <w:lvlText w:val="o"/>
+      <w:lvlJc w:val="left"/>
+      <w:pPr>
+        <w:ind w:left="1440" w:hanging="360"/>
+      </w:pPr>
+      <w:rPr>
+        <w:rFonts w:ascii="Courier New" w:hAnsi="Courier New" w:cs="Courier New" w:hint="default"/>
+      </w:rPr>
+    </w:lvl>
+    <w:lvl w:ilvl="2" w:tplc="04090005" w:tentative="1">
+      <w:start w:val="1"/>
+      <w:numFmt w:val="bullet"/>
+      <w:lvlText w:val=""/>
+      <w:lvlJc w:val="left"/>
+      <w:pPr>
+        <w:ind w:left="2160" w:hanging="360"/>
+      </w:pPr>
+      <w:rPr>
+        <w:rFonts w:ascii="Wingdings" w:hAnsi="Wingdings" w:hint="default"/>
+      </w:rPr>
+    </w:lvl>
+    <w:lvl w:ilvl="3" w:tplc="04090001" w:tentative="1">
+      <w:start w:val="1"/>
+      <w:numFmt w:val="bullet"/>
+      <w:lvlText w:val=""/>
+      <w:lvlJc w:val="left"/>
+      <w:pPr>
+        <w:ind w:left="2880" w:hanging="360"/>
+      </w:pPr>
+      <w:rPr>
+        <w:rFonts w:ascii="Symbol" w:hAnsi="Symbol" w:hint="default"/>
+      </w:rPr>
+    </w:lvl>
+    <w:lvl w:ilvl="4" w:tplc="04090003" w:tentative="1">
+      <w:start w:val="1"/>
+      <w:numFmt w:val="bullet"/>
+      <w:lvlText w:val="o"/>
+      <w:lvlJc w:val="left"/>
+      <w:pPr>
+        <w:ind w:left="3600" w:hanging="360"/>
+      </w:pPr>
+      <w:rPr>
+        <w:rFonts w:ascii="Courier New" w:hAnsi="Courier New" w:cs="Courier New" w:hint="default"/>
+      </w:rPr>
+    </w:lvl>
+    <w:lvl w:ilvl="5" w:tplc="04090005" w:tentative="1">
+      <w:start w:val="1"/>
+      <w:numFmt w:val="bullet"/>
+      <w:lvlText w:val=""/>
+      <w:lvlJc w:val="left"/>
+      <w:pPr>
+        <w:ind w:left="4320" w:hanging="360"/>
+      </w:pPr>
+      <w:rPr>
+        <w:rFonts w:ascii="Wingdings" w:hAnsi="Wingdings" w:hint="default"/>
+      </w:rPr>
+    </w:lvl>
+    <w:lvl w:ilvl="6" w:tplc="04090001" w:tentative="1">
+      <w:start w:val="1"/>
+      <w:numFmt w:val="bullet"/>
+      <w:lvlText w:val=""/>
+      <w:lvlJc w:val="left"/>
+      <w:pPr>
+        <w:ind w:left="5040" w:hanging="360"/>
+      </w:pPr>
+      <w:rPr>
+        <w:rFonts w:ascii="Symbol" w:hAnsi="Symbol" w:hint="default"/>
+      </w:rPr>
+    </w:lvl>
+    <w:lvl w:ilvl="7" w:tplc="04090003" w:tentative="1">
+      <w:start w:val="1"/>
+      <w:numFmt w:val="bullet"/>
+      <w:lvlText w:val="o"/>
+      <w:lvlJc w:val="left"/>
+      <w:pPr>
+        <w:ind w:left="5760" w:hanging="360"/>
+      </w:pPr>
+      <w:rPr>
+        <w:rFonts w:ascii="Courier New" w:hAnsi="Courier New" w:cs="Courier New" w:hint="default"/>
+      </w:rPr>
+    </w:lvl>
+    <w:lvl w:ilvl="8" w:tplc="04090005" w:tentative="1">
+      <w:start w:val="1"/>
+      <w:numFmt w:val="bullet"/>
+      <w:lvlText w:val=""/>
+      <w:lvlJc w:val="left"/>
+      <w:pPr>
+        <w:ind w:left="6480" w:hanging="360"/>
+      </w:pPr>
+      <w:rPr>
+        <w:rFonts w:ascii="Wingdings" w:hAnsi="Wingdings" w:hint="default"/>
+      </w:rPr>
+    </w:lvl>
+  </w:abstractNum>
+  <w:abstractNum w:abstractNumId="14" w15:restartNumberingAfterBreak="0">
+    <w:nsid w:val="5A9E2C07"/>
+    <w:multiLevelType w:val="multilevel"/>
+    <w:tmpl w:val="0409001D"/>
+    <w:styleLink w:val="CurrentList3"/>
+    <w:lvl w:ilvl="0">
+      <w:start w:val="1"/>
+      <w:numFmt w:val="decimal"/>
+      <w:lvlText w:val="%1)"/>
+      <w:lvlJc w:val="left"/>
+      <w:pPr>
+        <w:ind w:left="360" w:hanging="360"/>
+      </w:pPr>
+    </w:lvl>
+    <w:lvl w:ilvl="1">
+      <w:start w:val="1"/>
+      <w:numFmt w:val="lowerLetter"/>
+      <w:lvlText w:val="%2)"/>
+      <w:lvlJc w:val="left"/>
+      <w:pPr>
+        <w:ind w:left="720" w:hanging="360"/>
+      </w:pPr>
+    </w:lvl>
+    <w:lvl w:ilvl="2">
+      <w:start w:val="1"/>
+      <w:numFmt w:val="lowerRoman"/>
+      <w:lvlText w:val="%3)"/>
+      <w:lvlJc w:val="left"/>
+      <w:pPr>
+        <w:ind w:left="1080" w:hanging="360"/>
+      </w:pPr>
+    </w:lvl>
+    <w:lvl w:ilvl="3">
+      <w:start w:val="1"/>
+      <w:numFmt w:val="decimal"/>
+      <w:lvlText w:val="(%4)"/>
+      <w:lvlJc w:val="left"/>
+      <w:pPr>
+        <w:ind w:left="1440" w:hanging="360"/>
+      </w:pPr>
+    </w:lvl>
+    <w:lvl w:ilvl="4">
+      <w:start w:val="1"/>
+      <w:numFmt w:val="lowerLetter"/>
+      <w:lvlText w:val="(%5)"/>
+      <w:lvlJc w:val="left"/>
+      <w:pPr>
+        <w:ind w:left="1800" w:hanging="360"/>
+      </w:pPr>
+    </w:lvl>
+    <w:lvl w:ilvl="5">
+      <w:start w:val="1"/>
+      <w:numFmt w:val="lowerRoman"/>
+      <w:lvlText w:val="(%6)"/>
+      <w:lvlJc w:val="left"/>
+      <w:pPr>
+        <w:ind w:left="2160" w:hanging="360"/>
+      </w:pPr>
+    </w:lvl>
+    <w:lvl w:ilvl="6">
+      <w:start w:val="1"/>
+      <w:numFmt w:val="decimal"/>
+      <w:lvlText w:val="%7."/>
+      <w:lvlJc w:val="left"/>
+      <w:pPr>
+        <w:ind w:left="2520" w:hanging="360"/>
+      </w:pPr>
+    </w:lvl>
+    <w:lvl w:ilvl="7">
+      <w:start w:val="1"/>
+      <w:numFmt w:val="lowerLetter"/>
+      <w:lvlText w:val="%8."/>
+      <w:lvlJc w:val="left"/>
+      <w:pPr>
+        <w:ind w:left="2880" w:hanging="360"/>
+      </w:pPr>
+    </w:lvl>
+    <w:lvl w:ilvl="8">
+      <w:start w:val="1"/>
+      <w:numFmt w:val="lowerRoman"/>
+      <w:lvlText w:val="%9."/>
+      <w:lvlJc w:val="left"/>
+      <w:pPr>
+        <w:ind w:left="3240" w:hanging="360"/>
+      </w:pPr>
+    </w:lvl>
+  </w:abstractNum>
+  <w:abstractNum w:abstractNumId="15" w15:restartNumberingAfterBreak="0">
+    <w:nsid w:val="5ED842CF"/>
+    <w:multiLevelType w:val="hybridMultilevel"/>
+    <w:tmpl w:val="7E66A98E"/>
+    <w:lvl w:ilvl="0" w:tplc="F3467854">
+      <w:start w:val="1"/>
+      <w:numFmt w:val="bullet"/>
+      <w:lvlText w:val=""/>
+      <w:lvlJc w:val="left"/>
+      <w:pPr>
+        <w:ind w:left="720" w:hanging="360"/>
+      </w:pPr>
+      <w:rPr>
+        <w:rFonts w:ascii="Symbol" w:hAnsi="Symbol" w:hint="default"/>
+      </w:rPr>
+    </w:lvl>
+    <w:lvl w:ilvl="1" w:tplc="04090003">
+      <w:start w:val="1"/>
+      <w:numFmt w:val="bullet"/>
+      <w:lvlText w:val="o"/>
+      <w:lvlJc w:val="left"/>
+      <w:pPr>
+        <w:ind w:left="1440" w:hanging="360"/>
+      </w:pPr>
+      <w:rPr>
+        <w:rFonts w:ascii="Courier New" w:hAnsi="Courier New" w:cs="Courier New" w:hint="default"/>
+      </w:rPr>
+    </w:lvl>
+    <w:lvl w:ilvl="2" w:tplc="04090005" w:tentative="1">
+      <w:start w:val="1"/>
+      <w:numFmt w:val="bullet"/>
+      <w:lvlText w:val=""/>
+      <w:lvlJc w:val="left"/>
+      <w:pPr>
+        <w:ind w:left="2160" w:hanging="360"/>
+      </w:pPr>
+      <w:rPr>
+        <w:rFonts w:ascii="Wingdings" w:hAnsi="Wingdings" w:hint="default"/>
+      </w:rPr>
+    </w:lvl>
+    <w:lvl w:ilvl="3" w:tplc="04090001" w:tentative="1">
+      <w:start w:val="1"/>
+      <w:numFmt w:val="bullet"/>
+      <w:lvlText w:val=""/>
+      <w:lvlJc w:val="left"/>
+      <w:pPr>
+        <w:ind w:left="2880" w:hanging="360"/>
+      </w:pPr>
+      <w:rPr>
+        <w:rFonts w:ascii="Symbol" w:hAnsi="Symbol" w:hint="default"/>
+      </w:rPr>
+    </w:lvl>
+    <w:lvl w:ilvl="4" w:tplc="04090003" w:tentative="1">
+      <w:start w:val="1"/>
+      <w:numFmt w:val="bullet"/>
+      <w:lvlText w:val="o"/>
+      <w:lvlJc w:val="left"/>
+      <w:pPr>
+        <w:ind w:left="3600" w:hanging="360"/>
+      </w:pPr>
+      <w:rPr>
+        <w:rFonts w:ascii="Courier New" w:hAnsi="Courier New" w:cs="Courier New" w:hint="default"/>
+      </w:rPr>
+    </w:lvl>
+    <w:lvl w:ilvl="5" w:tplc="04090005" w:tentative="1">
+      <w:start w:val="1"/>
+      <w:numFmt w:val="bullet"/>
+      <w:lvlText w:val=""/>
+      <w:lvlJc w:val="left"/>
+      <w:pPr>
+        <w:ind w:left="4320" w:hanging="360"/>
+      </w:pPr>
+      <w:rPr>
+        <w:rFonts w:ascii="Wingdings" w:hAnsi="Wingdings" w:hint="default"/>
+      </w:rPr>
+    </w:lvl>
+    <w:lvl w:ilvl="6" w:tplc="04090001" w:tentative="1">
+      <w:start w:val="1"/>
+      <w:numFmt w:val="bullet"/>
+      <w:lvlText w:val=""/>
+      <w:lvlJc w:val="left"/>
+      <w:pPr>
+        <w:ind w:left="5040" w:hanging="360"/>
+      </w:pPr>
+      <w:rPr>
+        <w:rFonts w:ascii="Symbol" w:hAnsi="Symbol" w:hint="default"/>
+      </w:rPr>
+    </w:lvl>
+    <w:lvl w:ilvl="7" w:tplc="04090003" w:tentative="1">
+      <w:start w:val="1"/>
+      <w:numFmt w:val="bullet"/>
+      <w:lvlText w:val="o"/>
+      <w:lvlJc w:val="left"/>
+      <w:pPr>
+        <w:ind w:left="5760" w:hanging="360"/>
+      </w:pPr>
+      <w:rPr>
+        <w:rFonts w:ascii="Courier New" w:hAnsi="Courier New" w:cs="Courier New" w:hint="default"/>
+      </w:rPr>
+    </w:lvl>
+    <w:lvl w:ilvl="8" w:tplc="04090005" w:tentative="1">
+      <w:start w:val="1"/>
+      <w:numFmt w:val="bullet"/>
+      <w:lvlText w:val=""/>
+      <w:lvlJc w:val="left"/>
+      <w:pPr>
+        <w:ind w:left="6480" w:hanging="360"/>
+      </w:pPr>
+      <w:rPr>
+        <w:rFonts w:ascii="Wingdings" w:hAnsi="Wingdings" w:hint="default"/>
+      </w:rPr>
+    </w:lvl>
+  </w:abstractNum>
+  <w:abstractNum w:abstractNumId="16" w15:restartNumberingAfterBreak="0">
+    <w:nsid w:val="75784653"/>
+    <w:multiLevelType w:val="multilevel"/>
+    <w:tmpl w:val="0409001D"/>
+    <w:styleLink w:val="CurrentList4"/>
+    <w:lvl w:ilvl="0">
+      <w:start w:val="1"/>
+      <w:numFmt w:val="decimal"/>
+      <w:lvlText w:val="%1)"/>
+      <w:lvlJc w:val="left"/>
+      <w:pPr>
+        <w:ind w:left="360" w:hanging="360"/>
+      </w:pPr>
+    </w:lvl>
+    <w:lvl w:ilvl="1">
+      <w:start w:val="1"/>
+      <w:numFmt w:val="lowerLetter"/>
+      <w:lvlText w:val="%2)"/>
+      <w:lvlJc w:val="left"/>
+      <w:pPr>
+        <w:ind w:left="720" w:hanging="360"/>
+      </w:pPr>
+    </w:lvl>
+    <w:lvl w:ilvl="2">
+      <w:start w:val="1"/>
+      <w:numFmt w:val="lowerRoman"/>
+      <w:lvlText w:val="%3)"/>
+      <w:lvlJc w:val="left"/>
+      <w:pPr>
+        <w:ind w:left="1080" w:hanging="360"/>
+      </w:pPr>
+    </w:lvl>
+    <w:lvl w:ilvl="3">
+      <w:start w:val="1"/>
+      <w:numFmt w:val="decimal"/>
+      <w:lvlText w:val="(%4)"/>
+      <w:lvlJc w:val="left"/>
+      <w:pPr>
+        <w:ind w:left="1440" w:hanging="360"/>
+      </w:pPr>
+    </w:lvl>
+    <w:lvl w:ilvl="4">
+      <w:start w:val="1"/>
+      <w:numFmt w:val="lowerLetter"/>
+      <w:lvlText w:val="(%5)"/>
+      <w:lvlJc w:val="left"/>
+      <w:pPr>
+        <w:ind w:left="1800" w:hanging="360"/>
+      </w:pPr>
+    </w:lvl>
+    <w:lvl w:ilvl="5">
+      <w:start w:val="1"/>
+      <w:numFmt w:val="lowerRoman"/>
+      <w:lvlText w:val="(%6)"/>
+      <w:lvlJc w:val="left"/>
+      <w:pPr>
+        <w:ind w:left="2160" w:hanging="360"/>
+      </w:pPr>
+    </w:lvl>
+    <w:lvl w:ilvl="6">
+      <w:start w:val="1"/>
+      <w:numFmt w:val="decimal"/>
+      <w:lvlText w:val="%7."/>
+      <w:lvlJc w:val="left"/>
+      <w:pPr>
+        <w:ind w:left="2520" w:hanging="360"/>
+      </w:pPr>
+    </w:lvl>
+    <w:lvl w:ilvl="7">
+      <w:start w:val="1"/>
+      <w:numFmt w:val="lowerLetter"/>
+      <w:lvlText w:val="%8."/>
+      <w:lvlJc w:val="left"/>
+      <w:pPr>
+        <w:ind w:left="2880" w:hanging="360"/>
+      </w:pPr>
+    </w:lvl>
+    <w:lvl w:ilvl="8">
+      <w:start w:val="1"/>
+      <w:numFmt w:val="lowerRoman"/>
+      <w:lvlText w:val="%9."/>
+      <w:lvlJc w:val="left"/>
+      <w:pPr>
+        <w:ind w:left="3240" w:hanging="360"/>
+      </w:pPr>
+    </w:lvl>
+  </w:abstractNum>
+  <w:abstractNum w:abstractNumId="17" w15:restartNumberingAfterBreak="0">
+    <w:nsid w:val="793E140B"/>
+    <w:multiLevelType w:val="hybridMultilevel"/>
+    <w:tmpl w:val="3A6CBEE6"/>
+    <w:lvl w:ilvl="0" w:tplc="ABAC7000">
+      <w:start w:val="1"/>
+      <w:numFmt w:val="none"/>
+      <w:lvlText w:val="%1."/>
+      <w:lvlJc w:val="left"/>
+      <w:pPr>
+        <w:ind w:left="0" w:firstLine="720"/>
+      </w:pPr>
+      <w:rPr>
+        <w:rFonts w:hint="default"/>
+      </w:rPr>
+    </w:lvl>
+    <w:lvl w:ilvl="1" w:tplc="04090019" w:tentative="1">
+      <w:start w:val="1"/>
+      <w:numFmt w:val="lowerLetter"/>
+      <w:lvlText w:val="%2."/>
+      <w:lvlJc w:val="left"/>
+      <w:pPr>
+        <w:ind w:left="1440" w:hanging="360"/>
+      </w:pPr>
+    </w:lvl>
+    <w:lvl w:ilvl="2" w:tplc="0409001B" w:tentative="1">
+      <w:start w:val="1"/>
+      <w:numFmt w:val="lowerRoman"/>
+      <w:lvlText w:val="%3."/>
+      <w:lvlJc w:val="right"/>
+      <w:pPr>
+        <w:ind w:left="2160" w:hanging="180"/>
+      </w:pPr>
+    </w:lvl>
+    <w:lvl w:ilvl="3" w:tplc="0409000F" w:tentative="1">
+      <w:start w:val="1"/>
+      <w:numFmt w:val="decimal"/>
+      <w:lvlText w:val="%4."/>
+      <w:lvlJc w:val="left"/>
+      <w:pPr>
+        <w:ind w:left="2880" w:hanging="360"/>
+      </w:pPr>
+    </w:lvl>
+    <w:lvl w:ilvl="4" w:tplc="04090019" w:tentative="1">
+      <w:start w:val="1"/>
+      <w:numFmt w:val="lowerLetter"/>
+      <w:lvlText w:val="%5."/>
+      <w:lvlJc w:val="left"/>
+      <w:pPr>
+        <w:ind w:left="3600" w:hanging="360"/>
+      </w:pPr>
+    </w:lvl>
+    <w:lvl w:ilvl="5" w:tplc="0409001B" w:tentative="1">
+      <w:start w:val="1"/>
+      <w:numFmt w:val="lowerRoman"/>
+      <w:lvlText w:val="%6."/>
+      <w:lvlJc w:val="right"/>
+      <w:pPr>
+        <w:ind w:left="4320" w:hanging="180"/>
+      </w:pPr>
+    </w:lvl>
+    <w:lvl w:ilvl="6" w:tplc="0409000F" w:tentative="1">
+      <w:start w:val="1"/>
+      <w:numFmt w:val="decimal"/>
+      <w:lvlText w:val="%7."/>
+      <w:lvlJc w:val="left"/>
+      <w:pPr>
+        <w:ind w:left="5040" w:hanging="360"/>
+      </w:pPr>
+    </w:lvl>
+    <w:lvl w:ilvl="7" w:tplc="04090019" w:tentative="1">
+      <w:start w:val="1"/>
+      <w:numFmt w:val="lowerLetter"/>
+      <w:lvlText w:val="%8."/>
+      <w:lvlJc w:val="left"/>
+      <w:pPr>
+        <w:ind w:left="5760" w:hanging="360"/>
+      </w:pPr>
+    </w:lvl>
+    <w:lvl w:ilvl="8" w:tplc="0409001B" w:tentative="1">
+      <w:start w:val="1"/>
+      <w:numFmt w:val="lowerRoman"/>
+      <w:lvlText w:val="%9."/>
+      <w:lvlJc w:val="right"/>
+      <w:pPr>
+        <w:ind w:left="6480" w:hanging="180"/>
+      </w:pPr>
+    </w:lvl>
+  </w:abstractNum>
   <w:num w:numId="1" w16cid:durableId="1069957984">
+    <w:abstractNumId w:val="4"/>
+  </w:num>
+  <w:num w:numId="2" w16cid:durableId="366950910">
+    <w:abstractNumId w:val="1"/>
+  </w:num>
+  <w:num w:numId="3" w16cid:durableId="948204086">
+    <w:abstractNumId w:val="12"/>
+  </w:num>
+  <w:num w:numId="4" w16cid:durableId="299266238">
+    <w:abstractNumId w:val="17"/>
+  </w:num>
+  <w:num w:numId="5" w16cid:durableId="75327360">
+    <w:abstractNumId w:val="5"/>
+  </w:num>
+  <w:num w:numId="6" w16cid:durableId="594441224">
+    <w:abstractNumId w:val="10"/>
+  </w:num>
+  <w:num w:numId="7" w16cid:durableId="1603759395">
+    <w:abstractNumId w:val="8"/>
+  </w:num>
+  <w:num w:numId="8" w16cid:durableId="844855342">
+    <w:abstractNumId w:val="15"/>
+  </w:num>
+  <w:num w:numId="9" w16cid:durableId="509216792">
+    <w:abstractNumId w:val="9"/>
+  </w:num>
+  <w:num w:numId="10" w16cid:durableId="1307275504">
+    <w:abstractNumId w:val="7"/>
+  </w:num>
+  <w:num w:numId="11" w16cid:durableId="290863755">
+    <w:abstractNumId w:val="6"/>
+  </w:num>
+  <w:num w:numId="12" w16cid:durableId="967200955">
+    <w:abstractNumId w:val="13"/>
+  </w:num>
+  <w:num w:numId="13" w16cid:durableId="689526260">
+    <w:abstractNumId w:val="2"/>
+  </w:num>
+  <w:num w:numId="14" w16cid:durableId="603150816">
+    <w:abstractNumId w:val="11"/>
+  </w:num>
+  <w:num w:numId="15" w16cid:durableId="874193138">
+    <w:abstractNumId w:val="3"/>
+  </w:num>
+  <w:num w:numId="16" w16cid:durableId="241136899">
     <w:abstractNumId w:val="0"/>
+  </w:num>
+  <w:num w:numId="17" w16cid:durableId="153955372">
+    <w:abstractNumId w:val="14"/>
+  </w:num>
+  <w:num w:numId="18" w16cid:durableId="478963905">
+    <w:abstractNumId w:val="16"/>
   </w:num>
 </w:numbering>
 </file>
@@ -738,6 +2636,7 @@
     </w:pPrDefault>
   </w:docDefaults>
   <w:latentStyles w:defLockedState="0" w:defUIPriority="0" w:defSemiHidden="0" w:defUnhideWhenUsed="0" w:defQFormat="0" w:count="376">
+    <w:lsdException w:name="Body Text" w:qFormat="1"/>
     <w:lsdException w:name="Normal Table" w:semiHidden="1" w:unhideWhenUsed="1"/>
     <w:lsdException w:name="Table Simple 1" w:semiHidden="1" w:unhideWhenUsed="1"/>
     <w:lsdException w:name="Table Simple 2" w:semiHidden="1" w:unhideWhenUsed="1"/>
@@ -984,9 +2883,9 @@
   <w:style w:type="paragraph" w:default="1" w:styleId="Normal">
     <w:name w:val="Normal"/>
     <w:qFormat/>
-    <w:rsid w:val="00A314E0"/>
+    <w:rsid w:val="006037F0"/>
     <w:pPr>
-      <w:spacing w:after="100" w:line="360" w:lineRule="auto"/>
+      <w:spacing w:before="120" w:after="120"/>
     </w:pPr>
     <w:rPr>
       <w:rFonts w:ascii="Century Schoolbook" w:hAnsi="Century Schoolbook"/>
@@ -998,11 +2897,11 @@
     <w:next w:val="BodyText"/>
     <w:uiPriority w:val="9"/>
     <w:qFormat/>
-    <w:rsid w:val="008E522C"/>
+    <w:rsid w:val="0047153C"/>
     <w:pPr>
       <w:keepNext/>
       <w:keepLines/>
-      <w:spacing w:before="480" w:after="0"/>
+      <w:spacing w:before="480" w:after="240"/>
       <w:outlineLvl w:val="0"/>
     </w:pPr>
     <w:rPr>
@@ -1210,26 +3109,24 @@
     <w:name w:val="Body Text"/>
     <w:basedOn w:val="Normal"/>
     <w:qFormat/>
-    <w:rsid w:val="00D25ECB"/>
-    <w:pPr>
-      <w:spacing w:after="240" w:line="240" w:lineRule="auto"/>
-      <w:ind w:left="360"/>
-    </w:pPr>
+    <w:rsid w:val="006037F0"/>
   </w:style>
   <w:style w:type="paragraph" w:customStyle="1" w:styleId="FirstParagraph">
     <w:name w:val="First Paragraph"/>
     <w:basedOn w:val="BodyText"/>
     <w:next w:val="BodyText"/>
     <w:qFormat/>
-    <w:rsid w:val="001B5A32"/>
+    <w:rsid w:val="005B051B"/>
   </w:style>
   <w:style w:type="paragraph" w:customStyle="1" w:styleId="Compact">
     <w:name w:val="Compact"/>
     <w:basedOn w:val="BodyText"/>
     <w:qFormat/>
-    <w:rsid w:val="007F2DBA"/>
+    <w:rsid w:val="006037F0"/>
     <w:pPr>
-      <w:spacing w:after="0"/>
+      <w:numPr>
+        <w:numId w:val="12"/>
+      </w:numPr>
     </w:pPr>
   </w:style>
   <w:style w:type="paragraph" w:styleId="Title">
@@ -1376,9 +3273,6 @@
     <w:name w:val="caption"/>
     <w:basedOn w:val="Normal"/>
     <w:link w:val="CaptionChar"/>
-    <w:pPr>
-      <w:spacing w:after="120"/>
-    </w:pPr>
     <w:rPr>
       <w:i/>
     </w:rPr>
@@ -1509,8 +3403,50 @@
     <w:name w:val="Address"/>
     <w:basedOn w:val="Normal"/>
     <w:qFormat/>
+    <w:rsid w:val="004D1CAA"/>
     <w:pPr>
-      <w:spacing w:after="0" w:line="240" w:lineRule="auto"/>
+      <w:spacing w:after="0"/>
+      <w:jc w:val="right"/>
+    </w:pPr>
+  </w:style>
+  <w:style w:type="numbering" w:customStyle="1" w:styleId="CurrentList1">
+    <w:name w:val="Current List1"/>
+    <w:uiPriority w:val="99"/>
+    <w:rsid w:val="003458EA"/>
+    <w:pPr>
+      <w:numPr>
+        <w:numId w:val="13"/>
+      </w:numPr>
+    </w:pPr>
+  </w:style>
+  <w:style w:type="numbering" w:customStyle="1" w:styleId="CurrentList2">
+    <w:name w:val="Current List2"/>
+    <w:uiPriority w:val="99"/>
+    <w:rsid w:val="003458EA"/>
+    <w:pPr>
+      <w:numPr>
+        <w:numId w:val="16"/>
+      </w:numPr>
+    </w:pPr>
+  </w:style>
+  <w:style w:type="numbering" w:customStyle="1" w:styleId="CurrentList3">
+    <w:name w:val="Current List3"/>
+    <w:uiPriority w:val="99"/>
+    <w:rsid w:val="005B051B"/>
+    <w:pPr>
+      <w:numPr>
+        <w:numId w:val="17"/>
+      </w:numPr>
+    </w:pPr>
+  </w:style>
+  <w:style w:type="numbering" w:customStyle="1" w:styleId="CurrentList4">
+    <w:name w:val="Current List4"/>
+    <w:uiPriority w:val="99"/>
+    <w:rsid w:val="00F375B2"/>
+    <w:pPr>
+      <w:numPr>
+        <w:numId w:val="18"/>
+      </w:numPr>
     </w:pPr>
   </w:style>
 </w:styles>

</xml_diff>